<commit_message>
changes to manuscript text
</commit_message>
<xml_diff>
--- a/manuscript.docx
+++ b/manuscript.docx
@@ -7,7 +7,7 @@
         <w:pStyle w:val="Title"/>
       </w:pPr>
       <w:r>
-        <w:t xml:space="preserve">A network-based approach to characterize heterogeneous bioinformatics training needs: Analysis of the SIB training survey</w:t>
+        <w:t xml:space="preserve">Characterization of heterogeneous bioinformatics training needs: insights in AI priorities and beyond</w:t>
       </w:r>
     </w:p>
     <w:p>
@@ -31,7 +31,71 @@
         <w:pStyle w:val="Abstract"/>
       </w:pPr>
       <w:r>
-        <w:t xml:space="preserve">Bioinformatics training providers face significant challenges in designing curricula for highly heterogeneous researcher communities spanning multiple career stages, scientific domains, and organizational types. This complexity is further amplified by the rapid advances in computational life scienes, like integration of Artificial Intelligence (AI), which shifts the baseline competencies researchers require. This study presents a systematic methodology for identifying training requirements using survey data from the SIB Swiss Institute of Bioinformatics. Moving beyond simple descriptive statistics, we implement a graph-based data processing workflow. Respondents are modeled as nodes in a network, with connections indicating pairwise correlation across 5-point Likert-type questions covering five primary computational biology domains. By applying Louvain community detection to this network, we uncover four distinct respondent archetypes characterized by coherent, specific training demands: AI and Data, Infectious Disease Genomics, Functional Genomics, and Biochemistry, Imaging &amp; AI. We profile these clusters against preferred learning modalities (e.g., Problem-Based Learning, asynchronous e-learning) and structural participation barriers (e.g., physical distance, institutional funding constraints). Our results demonstrate that data-driven learner profiling provides a more actionable foundation for modular curriculum design than traditional demographic subdivisions, enabling training organizations to optimize resource allocation and enhance pedagogical efficacy in an AI-disrupted educational landscape.</w:t>
+        <w:rPr>
+          <w:b/>
+          <w:bCs/>
+        </w:rPr>
+        <w:t xml:space="preserve">Background:</w:t>
+      </w:r>
+      <w:r>
+        <w:t xml:space="preserve"> </w:t>
+      </w:r>
+      <w:r>
+        <w:t xml:space="preserve">Bioinformatics training demands are heterogeneous, and it can be challenging to design training programs that meet diverse needs, especially in the context of emerging technologies, like generative AI. To address this, we analyzed the 2026 SIB Swiss Institute of Bioinformatics (SIB) training needs survey using a network-based strategy that identifies respondent subgroups from shared topic preferences.</w:t>
+      </w:r>
+    </w:p>
+    <w:p>
+      <w:pPr>
+        <w:pStyle w:val="Abstract"/>
+      </w:pPr>
+      <w:r>
+        <w:rPr>
+          <w:b/>
+          <w:bCs/>
+        </w:rPr>
+        <w:t xml:space="preserve">Methods:</w:t>
+      </w:r>
+      <w:r>
+        <w:t xml:space="preserve"> </w:t>
+      </w:r>
+      <w:r>
+        <w:t xml:space="preserve">We analyzed 260 responses collected over 6 weeks (March-April 2026), including Likert-type ratings for training topics, participation barriers, and preferred course formats, plus demographic variables. Responses were analyzed as a single group and as clusters. For cluster analysis, respondents were represented as nodes in a correlation network built from course-topic ratings and Louvain community detection was applied to identify clusters. Cluster profiles were then characterized using topic priorities, barriers, format preferences, and demographics.</w:t>
+      </w:r>
+    </w:p>
+    <w:p>
+      <w:pPr>
+        <w:pStyle w:val="Abstract"/>
+      </w:pPr>
+      <w:r>
+        <w:rPr>
+          <w:b/>
+          <w:bCs/>
+        </w:rPr>
+        <w:t xml:space="preserve">Results:</w:t>
+      </w:r>
+      <w:r>
+        <w:t xml:space="preserve"> </w:t>
+      </w:r>
+      <w:r>
+        <w:t xml:space="preserve">Respondents indicated their need for training across a total of 33 possible course topics. Four of the possible topics related to AI/LLM skills and all of them were in the top six of most needed topics. Other than AI, there were high demands on reproducible data practices and computational methods. As course format, interactive and multi-day courses were generally preferred. Remarkably, AI-assisted learning formats were the least favored. Network analysis identified four interpretable learner profiles: AI and data, infectious disease genomics, functional genomics, and biochemistry, imaging &amp; AI, with each profile exhibiting distinct training needs and preferences.</w:t>
+      </w:r>
+    </w:p>
+    <w:p>
+      <w:pPr>
+        <w:pStyle w:val="Abstract"/>
+      </w:pPr>
+      <w:r>
+        <w:rPr>
+          <w:b/>
+          <w:bCs/>
+        </w:rPr>
+        <w:t xml:space="preserve">Conclusions:</w:t>
+      </w:r>
+      <w:r>
+        <w:t xml:space="preserve"> </w:t>
+      </w:r>
+      <w:r>
+        <w:t xml:space="preserve">There is a clear need for skills in AI and reproducible research, and respondents favored human interaction in learning formats. Network-based clustering revealed actionable training-need heterogeneity that is not captured by demographic stratification alone. Integrating these learner profiles into curriculum planning can improve course targeting, format selection, and barrier mitigation, supporting more effective and responsive bioinformatics training programs, particularly in the context of AI and emerging technologies.</w:t>
       </w:r>
     </w:p>
     <w:bookmarkStart w:id="9" w:name="introduction"/>
@@ -48,7 +112,7 @@
         <w:pStyle w:val="FirstParagraph"/>
       </w:pPr>
       <w:r>
-        <w:t xml:space="preserve">The rapid and continuous evolution of high-throughput experimental technologies, large-scale data infrastructures, and data management has made bioinformatics training a necessity for life science researchers</w:t>
+        <w:t xml:space="preserve">The rapid and continuous evolution of high-throughput experimental technologies, large-scale data infrastructures, and artificial intelligence (AI) makes bioinformatics training a necessity for life science researchers</w:t>
       </w:r>
       <w:r>
         <w:t xml:space="preserve"> </w:t>
@@ -57,7 +121,7 @@
         <w:t xml:space="preserve">(Via et al. 2011)</w:t>
       </w:r>
       <w:r>
-        <w:t xml:space="preserve">. National and international training providers, such as the SIB Swiss Institute of Bioinformatics, aim to provide high-quality, impactful courses to a heterogeneous audience. This audience ranges from academic PhD candidates requiring upskilling in specific analytical competences to corporate senior scientists or clinical personnel seeking broad overviews of emerging computational resources.</w:t>
+        <w:t xml:space="preserve">. National and international training providers, such as the SIB Swiss Institute of Bioinformatics (SIB), aim to provide high-quality, impactful courses to a heterogeneous audience. This audience ranges from academic PhD candidates requiring upskilling in specific analytical competences to corporate senior scientists or clinical personnel seeking broad overviews of emerging computational resources.</w:t>
       </w:r>
     </w:p>
     <w:p>
@@ -65,16 +129,24 @@
         <w:pStyle w:val="BodyText"/>
       </w:pPr>
       <w:r>
-        <w:t xml:space="preserve">The design of a bioinformatics training curriculum can be based on three dimensions: course topics, format, and logistics. The course topics address educational needs, while format involves alignment to preferences regarding learning formats (e.g., intensive block courses, problem-based learning, self-paced e-learning). Logistics involves mitigating systemic barriers to attendance, including geographical distance and financial restrictions. Previous training needs surveys have analyzed these dimensions independently or slice responses using classical demographic categories like career stage or geographic region</w:t>
-      </w:r>
-      <w:r>
-        <w:t xml:space="preserve"> </w:t>
-      </w:r>
-      <w:r>
-        <w:t xml:space="preserve">(Attwood et al. 2019; Drew et al. 2023)</w:t>
-      </w:r>
-      <w:r>
-        <w:t xml:space="preserve">. While informative, such an approach assumes that individuals within a demographic sub-group are homogeneous. However, a post-doctoral researcher in structural biology may share more training needs with an industry mass-spectrometry specialist than with a post-doctoral researcher in plant ecology. Already introduced in the eighties for market segmentation</w:t>
+        <w:t xml:space="preserve">It is an ongoing challenge to match the training needs of such a diverse audience. A frequently used tool to understand such needs are training needs surveys</w:t>
+      </w:r>
+      <w:r>
+        <w:t xml:space="preserve"> </w:t>
+      </w:r>
+      <w:r>
+        <w:t xml:space="preserve">(e.g. Geest et al. 2026; Attwood et al. 2019; Rocha et al. 2022; Sangeda et al. 2021; Velozo et al. 2024; Drew et al. 2023)</w:t>
+      </w:r>
+      <w:r>
+        <w:t xml:space="preserve">. These previous training needs surveys have analyzed various dimensions like course topics, format, and logistics independently or sliced responses using classical demographic categories like career stage or geographic region. While informative, such an approach assumes that individuals within a demographic sub-group are homogeneous. However, a post-doctoral researcher in structural biology may share more training needs with an industry mass-spectrometry specialist than with a post-doctoral researcher in plant ecology.</w:t>
+      </w:r>
+    </w:p>
+    <w:p>
+      <w:pPr>
+        <w:pStyle w:val="BodyText"/>
+      </w:pPr>
+      <w:r>
+        <w:t xml:space="preserve">Clustering of survey responses can be highly valuable for understanding such respondent heterogeneity. The approach was already introduced in the eighties for market segmentation</w:t>
       </w:r>
       <w:r>
         <w:t xml:space="preserve"> </w:t>
@@ -83,7 +155,16 @@
         <w:t xml:space="preserve">(Punj and Stewart 1983)</w:t>
       </w:r>
       <w:r>
-        <w:t xml:space="preserve">, identifying clusters of respondents with similar needs can provide a more actionable foundation for understanding needs various sub-groups. Applying such a data-driven approach to training needs analysis can help training providers to design modular curricula that are tailored to the specific needs of each cluster, rather than relying on broad demographic categories.</w:t>
+        <w:t xml:space="preserve">, and currently finds a wide range of applications</w:t>
+      </w:r>
+      <w:r>
+        <w:t xml:space="preserve"> </w:t>
+      </w:r>
+      <w:r>
+        <w:t xml:space="preserve">(Hooghe et al. 2016; Cheng et al. 2024; Hyde et al. 2019; Wenger and Lamamra 2024; Chung and Lee 2020)</w:t>
+      </w:r>
+      <w:r>
+        <w:t xml:space="preserve">. For our case of bioinformatics training needs, identifying clusters can identify survey respondents with similar needs. Therefore, it can help training providers design curricula that are tailored to the specific needs of these sub-groups, rather than relying on broad demographic categories.</w:t>
       </w:r>
     </w:p>
     <w:p>
@@ -100,7 +181,7 @@
         <w:t xml:space="preserve">(Wen Bin Goh et al. 2026; Ruan et al. 2026)</w:t>
       </w:r>
       <w:r>
-        <w:t xml:space="preserve">. AI is no longer just an advanced topic for specialized computer scientists; tools like GitHub Copilot and ChatGPT have shifted how researchers write code, automate workflows and retrieve data</w:t>
+        <w:t xml:space="preserve">. Various generative AI tools have shifted how researchers write code</w:t>
       </w:r>
       <w:r>
         <w:t xml:space="preserve"> </w:t>
@@ -109,7 +190,43 @@
         <w:t xml:space="preserve">(Jiang et al. 2026)</w:t>
       </w:r>
       <w:r>
-        <w:t xml:space="preserve">. This paradigm shift creates a dual challenge for training. First, curricula must adapt to include training on incorporating AI in their workflows but also on responsible and ethical AI usage. Second, pedagogical delivery must take into account that LLMs have become the most important source of information for many learners, which may either alleviate or worsen existing gaps in student engagement and prerequisite knowledge.</w:t>
+        <w:t xml:space="preserve">, automate workflows and retrieve data</w:t>
+      </w:r>
+      <w:r>
+        <w:t xml:space="preserve"> </w:t>
+      </w:r>
+      <w:r>
+        <w:t xml:space="preserve">(Sima and Farias 2023)</w:t>
+      </w:r>
+      <w:r>
+        <w:t xml:space="preserve">. LLM and generative AI are heavily used by scientists</w:t>
+      </w:r>
+      <w:r>
+        <w:t xml:space="preserve"> </w:t>
+      </w:r>
+      <w:r>
+        <w:t xml:space="preserve">(Daepp et al. 2026)</w:t>
+      </w:r>
+      <w:r>
+        <w:t xml:space="preserve">, and they are frequently used for education</w:t>
+      </w:r>
+      <w:r>
+        <w:t xml:space="preserve"> </w:t>
+      </w:r>
+      <w:r>
+        <w:t xml:space="preserve">(Bewersdorff et al. 2025; Wang et al. 2026)</w:t>
+      </w:r>
+      <w:r>
+        <w:t xml:space="preserve">, both in the classroom and for self-directed learning</w:t>
+      </w:r>
+      <w:r>
+        <w:t xml:space="preserve"> </w:t>
+      </w:r>
+      <w:r>
+        <w:t xml:space="preserve">(Esiyok et al. 2025; Wu et al. 2024)</w:t>
+      </w:r>
+      <w:r>
+        <w:t xml:space="preserve">. To understand the impact of AI on training needs, it is therefore important to identify what kind of AI-related topics are required by scientists. This can help training providers to design courses that address the specific needs, and to ensure that AI-related topics are integrated into the curriculum in a way that is relevant and useful for all learners.</w:t>
       </w:r>
     </w:p>
     <w:p>
@@ -117,7 +234,7 @@
         <w:pStyle w:val="BodyText"/>
       </w:pPr>
       <w:r>
-        <w:t xml:space="preserve">This paper describes a robust, reproducible, and data-driven framework for mapping training needs along the three dimensions using graph-based clustering. By converting individual responses into a correlation graph, we define clusters of learners who share common training needs, regardless of their institutional or regional backgrounds. We detail the underlying data preprocessing pipeline, a conceptual overview of graph construction, and subsequent characterization of the isolated learner profiles with a strong emphasis on how AI needs shape these profiles.</w:t>
+        <w:t xml:space="preserve">This paper describes a data-driven framework for mapping training needs based on the SIB training needs survey along the three dimensions of course topics, format, and logistics using graph-based clustering. By converting individual responses into a correlation graph, we define profiles of learners who share common training needs, regardless of their institutional or regional backgrounds. We detail the underlying data preprocessing pipeline, a conceptual overview of graph construction, and subsequent characterization of the learner profiles with an emphasis on how AI can be incorporated in training programs.</w:t>
       </w:r>
     </w:p>
     <w:bookmarkEnd w:id="9"/>
@@ -144,20 +261,7 @@
         <w:pStyle w:val="FirstParagraph"/>
       </w:pPr>
       <w:r>
-        <w:t xml:space="preserve">The SIB training needs survey collected information using a multi-tiered survey composed of main questions (acting as structural stems) and specific sub-questions representing individual items or technical sub-topics. All survey questions can be found on Zenodo</w:t>
-      </w:r>
-      <w:r>
-        <w:t xml:space="preserve"> </w:t>
-      </w:r>
-      <w:r>
-        <w:rPr>
-          <w:b/>
-          <w:bCs/>
-        </w:rPr>
-        <w:t xml:space="preserve">link</w:t>
-      </w:r>
-      <w:r>
-        <w:t xml:space="preserve">. In summary, the questionnaire evaluated course topics, barriers and formats using 5-point Likert-type scales:</w:t>
+        <w:t xml:space="preserve">The SIB training needs survey collected information using a multi-tiered survey composed of main questions (acting as structural stems) and specific sub-questions representing individual items or technical sub-topics. All survey questions can be found on Zenodo (https://zenodo.org/records/20446763). In summary, the questionnaire evaluated course topics, barriers and formats using 5-point Likert-type scales:</w:t>
       </w:r>
     </w:p>
     <w:p>
@@ -404,16 +508,7 @@
         <w:t xml:space="preserve">(R Core Team 2026)</w:t>
       </w:r>
       <w:r>
-        <w:t xml:space="preserve">; version 4.3.1) using the packages</w:t>
-      </w:r>
-      <w:r>
-        <w:t xml:space="preserve"> </w:t>
-      </w:r>
-      <w:r>
-        <w:rPr>
-          <w:rStyle w:val="VerbatimChar"/>
-        </w:rPr>
-        <w:t xml:space="preserve">dplyr</w:t>
+        <w:t xml:space="preserve">; version 4.3.1) using the packages dplyr</w:t>
       </w:r>
       <w:r>
         <w:t xml:space="preserve"> </w:t>
@@ -425,16 +520,7 @@
         <w:t xml:space="preserve"> </w:t>
       </w:r>
       <w:r>
-        <w:t xml:space="preserve">for data manipulation and</w:t>
-      </w:r>
-      <w:r>
-        <w:t xml:space="preserve"> </w:t>
-      </w:r>
-      <w:r>
-        <w:rPr>
-          <w:rStyle w:val="VerbatimChar"/>
-        </w:rPr>
-        <w:t xml:space="preserve">ggplot2</w:t>
+        <w:t xml:space="preserve">for data manipulation and ggplot2</w:t>
       </w:r>
       <w:r>
         <w:t xml:space="preserve"> </w:t>
@@ -446,7 +532,7 @@
         <w:t xml:space="preserve"> </w:t>
       </w:r>
       <w:r>
-        <w:t xml:space="preserve">for visualization.</w:t>
+        <w:t xml:space="preserve">for visualization. All code can be found on Zenodo (https://zenodo.org/records/20446763).</w:t>
       </w:r>
     </w:p>
     <w:bookmarkEnd w:id="11"/>
@@ -701,14 +787,14 @@
             <w:r>
               <w:drawing>
                 <wp:inline>
-                  <wp:extent cx="5943600" cy="4754880"/>
+                  <wp:extent cx="5080000" cy="5080000"/>
                   <wp:effectExtent b="0" l="0" r="0" t="0"/>
                   <wp:docPr descr="" title="" id="19" name="Picture"/>
                   <a:graphic>
                     <a:graphicData uri="http://schemas.openxmlformats.org/drawingml/2006/picture">
                       <pic:pic>
                         <pic:nvPicPr>
-                          <pic:cNvPr descr="manuscript_files/figure-docx/fig-demographics-1.jpeg" id="20" name="Picture"/>
+                          <pic:cNvPr descr="manuscript_files/figure-docx/fig-demographics-1.png" id="20" name="Picture"/>
                           <pic:cNvPicPr>
                             <a:picLocks noChangeArrowheads="1" noChangeAspect="1"/>
                           </pic:cNvPicPr>
@@ -722,7 +808,7 @@
                         <pic:spPr bwMode="auto">
                           <a:xfrm>
                             <a:off x="0" y="0"/>
-                            <a:ext cx="5943600" cy="4754880"/>
+                            <a:ext cx="5080000" cy="5080000"/>
                           </a:xfrm>
                           <a:prstGeom prst="rect">
                             <a:avLst/>
@@ -802,14 +888,14 @@
             <w:r>
               <w:drawing>
                 <wp:inline>
-                  <wp:extent cx="5943600" cy="14264640"/>
+                  <wp:extent cx="5080000" cy="15240000"/>
                   <wp:effectExtent b="0" l="0" r="0" t="0"/>
                   <wp:docPr descr="" title="" id="23" name="Picture"/>
                   <a:graphic>
                     <a:graphicData uri="http://schemas.openxmlformats.org/drawingml/2006/picture">
                       <pic:pic>
                         <pic:nvPicPr>
-                          <pic:cNvPr descr="manuscript_files/figure-docx/fig-likert-preferences-1.jpeg" id="24" name="Picture"/>
+                          <pic:cNvPr descr="manuscript_files/figure-docx/fig-likert-preferences-1.png" id="24" name="Picture"/>
                           <pic:cNvPicPr>
                             <a:picLocks noChangeArrowheads="1" noChangeAspect="1"/>
                           </pic:cNvPicPr>
@@ -823,7 +909,7 @@
                         <pic:spPr bwMode="auto">
                           <a:xfrm>
                             <a:off x="0" y="0"/>
-                            <a:ext cx="5943600" cy="14264640"/>
+                            <a:ext cx="5080000" cy="15240000"/>
                           </a:xfrm>
                           <a:prstGeom prst="rect">
                             <a:avLst/>
@@ -852,7 +938,28 @@
               <w:pStyle w:val="ImageCaption"/>
             </w:pPr>
             <w:r>
-              <w:t xml:space="preserve">Figure 3: Overall responses of training needs, shown in percentages and ordered by need.</w:t>
+              <w:t xml:space="preserve">Figure 3: Overall responses of training needs, shown in percentages and ordered by need. The topics are ordered by the proportion of respondents who indicated that they needed the topic (i.e. answered</w:t>
+            </w:r>
+            <w:r>
+              <w:t xml:space="preserve"> </w:t>
+            </w:r>
+            <w:r>
+              <w:t xml:space="preserve">“Very needed”</w:t>
+            </w:r>
+            <w:r>
+              <w:t xml:space="preserve"> </w:t>
+            </w:r>
+            <w:r>
+              <w:t xml:space="preserve">or</w:t>
+            </w:r>
+            <w:r>
+              <w:t xml:space="preserve"> </w:t>
+            </w:r>
+            <w:r>
+              <w:t xml:space="preserve">“Absolutely essential”</w:t>
+            </w:r>
+            <w:r>
+              <w:t xml:space="preserve">). Some topics have been abbreviated for clarity; the full topic names presented to the respondents can be found in the Supplementary Materials.</w:t>
             </w:r>
           </w:p>
           <w:bookmarkEnd w:id="25"/>
@@ -903,14 +1010,14 @@
             <w:r>
               <w:drawing>
                 <wp:inline>
-                  <wp:extent cx="5943600" cy="7132320"/>
+                  <wp:extent cx="5080000" cy="7620000"/>
                   <wp:effectExtent b="0" l="0" r="0" t="0"/>
                   <wp:docPr descr="" title="" id="27" name="Picture"/>
                   <a:graphic>
                     <a:graphicData uri="http://schemas.openxmlformats.org/drawingml/2006/picture">
                       <pic:pic>
                         <pic:nvPicPr>
-                          <pic:cNvPr descr="manuscript_files/figure-docx/fig-likert-barriers-1.jpeg" id="28" name="Picture"/>
+                          <pic:cNvPr descr="manuscript_files/figure-docx/fig-likert-barriers-1.png" id="28" name="Picture"/>
                           <pic:cNvPicPr>
                             <a:picLocks noChangeArrowheads="1" noChangeAspect="1"/>
                           </pic:cNvPicPr>
@@ -924,7 +1031,7 @@
                         <pic:spPr bwMode="auto">
                           <a:xfrm>
                             <a:off x="0" y="0"/>
-                            <a:ext cx="5943600" cy="7132320"/>
+                            <a:ext cx="5080000" cy="7620000"/>
                           </a:xfrm>
                           <a:prstGeom prst="rect">
                             <a:avLst/>
@@ -974,7 +1081,7 @@
         <w:pStyle w:val="BodyText"/>
       </w:pPr>
       <w:r>
-        <w:t xml:space="preserve">When asked about their preferred learning formats, respondents expressed a preference for blended modes, multi-day intensive courses and interactive and problem-based learning approaches, such as Bring Your Own Data (BYOD) and Problem-Based Learning (PBL). Remarkably, AI-assisted formats were generally less favored. The overall distribution of responses is shown in</w:t>
+        <w:t xml:space="preserve">When asked about their preferred learning formats, respondents expressed a preference for blended modes (a combination of synchronous and asynchronous learning), multi-day intensive courses (2-5 days of live course activities) and interactive and problem-based learning approaches, such as bring your own data (participants utilize their own datasets to learn) and project-based learning (participants work in groups to investigate real-world problems). Remarkably, AI-assisted formats (integrates AI technologies into education to personalize learning) were generally less favored. The overall distribution of responses is shown in</w:t>
       </w:r>
       <w:r>
         <w:t xml:space="preserve"> </w:t>
@@ -1013,14 +1120,14 @@
             <w:r>
               <w:drawing>
                 <wp:inline>
-                  <wp:extent cx="5943600" cy="7132320"/>
+                  <wp:extent cx="5080000" cy="7620000"/>
                   <wp:effectExtent b="0" l="0" r="0" t="0"/>
                   <wp:docPr descr="" title="" id="31" name="Picture"/>
                   <a:graphic>
                     <a:graphicData uri="http://schemas.openxmlformats.org/drawingml/2006/picture">
                       <pic:pic>
                         <pic:nvPicPr>
-                          <pic:cNvPr descr="manuscript_files/figure-docx/fig-likert-formats-1.jpeg" id="32" name="Picture"/>
+                          <pic:cNvPr descr="manuscript_files/figure-docx/fig-likert-formats-1.png" id="32" name="Picture"/>
                           <pic:cNvPicPr>
                             <a:picLocks noChangeArrowheads="1" noChangeAspect="1"/>
                           </pic:cNvPicPr>
@@ -1034,7 +1141,7 @@
                         <pic:spPr bwMode="auto">
                           <a:xfrm>
                             <a:off x="0" y="0"/>
-                            <a:ext cx="5943600" cy="7132320"/>
+                            <a:ext cx="5080000" cy="7620000"/>
                           </a:xfrm>
                           <a:prstGeom prst="rect">
                             <a:avLst/>
@@ -1072,7 +1179,7 @@
               <w:t xml:space="preserve">“Specify which learning formats you prefer. Note: these are not mutually exclusive, i.e. some can be used in combination”</w:t>
             </w:r>
             <w:r>
-              <w:t xml:space="preserve">. The formats are ordered by the proportion of respondents who indicated that they liked or strongly liked the format.</w:t>
+              <w:t xml:space="preserve">. The formats are ordered by the proportion of respondents who indicated that they liked or strongly liked the format. The original answers included an explanation of the format. For the full answers, please refer to the Supplementary Materials.</w:t>
             </w:r>
           </w:p>
           <w:bookmarkEnd w:id="33"/>
@@ -1142,14 +1249,14 @@
             <w:r>
               <w:drawing>
                 <wp:inline>
-                  <wp:extent cx="5943600" cy="5943600"/>
+                  <wp:extent cx="5080000" cy="6350000"/>
                   <wp:effectExtent b="0" l="0" r="0" t="0"/>
                   <wp:docPr descr="" title="" id="36" name="Picture"/>
                   <a:graphic>
                     <a:graphicData uri="http://schemas.openxmlformats.org/drawingml/2006/picture">
                       <pic:pic>
                         <pic:nvPicPr>
-                          <pic:cNvPr descr="manuscript_files/figure-docx/fig-course-cluster-network-1.jpeg" id="37" name="Picture"/>
+                          <pic:cNvPr descr="manuscript_files/figure-docx/fig-course-cluster-network-1.png" id="37" name="Picture"/>
                           <pic:cNvPicPr>
                             <a:picLocks noChangeArrowheads="1" noChangeAspect="1"/>
                           </pic:cNvPicPr>
@@ -1163,7 +1270,7 @@
                         <pic:spPr bwMode="auto">
                           <a:xfrm>
                             <a:off x="0" y="0"/>
-                            <a:ext cx="5943600" cy="5943600"/>
+                            <a:ext cx="5080000" cy="6350000"/>
                           </a:xfrm>
                           <a:prstGeom prst="rect">
                             <a:avLst/>
@@ -1192,7 +1299,7 @@
               <w:pStyle w:val="ImageCaption"/>
             </w:pPr>
             <w:r>
-              <w:t xml:space="preserve">Figure 6: Respondent network from course-topic preference correlations. Edge widths indicate stronger positive correlation; colors indicate Louvain communities.</w:t>
+              <w:t xml:space="preserve">Figure 6: Respondent network from course-topic preference correlations. Edge widths indicate stronger positive correlation; colors indicate Louvain communities. Cluster 5 is an outlier cluster with a single respondent and was removed from further analysis.</w:t>
             </w:r>
           </w:p>
           <w:bookmarkEnd w:id="38"/>
@@ -1662,7 +1769,7 @@
         <w:t xml:space="preserve">‘AI and data’</w:t>
       </w:r>
       <w:r>
-        <w:t xml:space="preserve">) is characterized by an interest in AI and data topics, including application LLMs and reproducible and FAIR Data. Cluster 2 (</w:t>
+        <w:t xml:space="preserve">) is characterized by an interest in best practices in AI and data, including application LLMs and reproducible and FAIR Data. Cluster 2 (</w:t>
       </w:r>
       <w:hyperlink w:anchor="fig-topics-by-cluster">
         <w:r>
@@ -1756,14 +1863,14 @@
             <w:r>
               <w:drawing>
                 <wp:inline>
-                  <wp:extent cx="5943600" cy="23774400"/>
+                  <wp:extent cx="5080000" cy="25400000"/>
                   <wp:effectExtent b="0" l="0" r="0" t="0"/>
                   <wp:docPr descr="" title="" id="42" name="Picture"/>
                   <a:graphic>
                     <a:graphicData uri="http://schemas.openxmlformats.org/drawingml/2006/picture">
                       <pic:pic>
                         <pic:nvPicPr>
-                          <pic:cNvPr descr="manuscript_files/figure-docx/fig-topics-by-cluster-1.jpeg" id="43" name="Picture"/>
+                          <pic:cNvPr descr="manuscript_files/figure-docx/fig-topics-by-cluster-1.png" id="43" name="Picture"/>
                           <pic:cNvPicPr>
                             <a:picLocks noChangeArrowheads="1" noChangeAspect="1"/>
                           </pic:cNvPicPr>
@@ -1777,7 +1884,7 @@
                         <pic:spPr bwMode="auto">
                           <a:xfrm>
                             <a:off x="0" y="0"/>
-                            <a:ext cx="5943600" cy="23774400"/>
+                            <a:ext cx="5080000" cy="25400000"/>
                           </a:xfrm>
                           <a:prstGeom prst="rect">
                             <a:avLst/>
@@ -1830,7 +1937,7 @@
               <w:t xml:space="preserve"> </w:t>
             </w:r>
             <w:r>
-              <w:t xml:space="preserve">(dark green) are shown. The numbers in the bars represent the count of respondents within the respective cluster selecting the answer. (A) Cluster 1: AI and data. (B) Cluster 2: Infectious disease genomics. (C) Cluster 3: Functional genomics. (D) Cluster 4: Biochemistry, imaging &amp; AI.</w:t>
+              <w:t xml:space="preserve">(dark green) are shown. The numbers in the bars represent the count of respondents within the respective cluster selecting the answer. (A) Cluster 1: AI and data. (B) Cluster 2: Infectious disease genomics. (C) Cluster 3: Functional genomics. (D) Cluster 4: Biochemistry, imaging &amp; AI. Some topics have been abbreviated for clarity; the full topic names presented to the respondents can be found in the Supplementary Materials.</w:t>
             </w:r>
           </w:p>
           <w:bookmarkEnd w:id="44"/>
@@ -1892,14 +1999,14 @@
             <w:r>
               <w:drawing>
                 <wp:inline>
-                  <wp:extent cx="5943600" cy="7132320"/>
+                  <wp:extent cx="5080000" cy="7620000"/>
                   <wp:effectExtent b="0" l="0" r="0" t="0"/>
                   <wp:docPr descr="" title="" id="46" name="Picture"/>
                   <a:graphic>
                     <a:graphicData uri="http://schemas.openxmlformats.org/drawingml/2006/picture">
                       <pic:pic>
                         <pic:nvPicPr>
-                          <pic:cNvPr descr="manuscript_files/figure-docx/fig-cluster-pie-career-1.jpeg" id="47" name="Picture"/>
+                          <pic:cNvPr descr="manuscript_files/figure-docx/fig-cluster-pie-career-1.png" id="47" name="Picture"/>
                           <pic:cNvPicPr>
                             <a:picLocks noChangeArrowheads="1" noChangeAspect="1"/>
                           </pic:cNvPicPr>
@@ -1913,7 +2020,7 @@
                         <pic:spPr bwMode="auto">
                           <a:xfrm>
                             <a:off x="0" y="0"/>
-                            <a:ext cx="5943600" cy="7132320"/>
+                            <a:ext cx="5080000" cy="7620000"/>
                           </a:xfrm>
                           <a:prstGeom prst="rect">
                             <a:avLst/>
@@ -1960,6 +2067,14 @@
         <w:t xml:space="preserve">4 Discussion</w:t>
       </w:r>
     </w:p>
+    <w:p>
+      <w:pPr>
+        <w:pStyle w:val="FirstParagraph"/>
+      </w:pPr>
+      <w:r>
+        <w:t xml:space="preserve">The results of the SIB training survey provide a snapshot on bioinformatics training needs of scientists in spring 2026, a period in which generative AI and large language models (LLMs) have become increasingly relevant. The survey design and analysis framework is unique within the context of bioinformatics education, and provides a comprehensive approach to understanding training needs, participation barriers, and preferred learning formats. Here, we discuss the overall survey outcomes that can be used for curriculum design on the short term, and the advantages of the analysis approach that can serve as a blueprint for future surveys on training needs.</w:t>
+      </w:r>
+    </w:p>
     <w:bookmarkStart w:id="54" w:name="overall-survey-outcomes"/>
     <w:p>
       <w:pPr>
@@ -1974,16 +2089,16 @@
         <w:pStyle w:val="FirstParagraph"/>
       </w:pPr>
       <w:r>
-        <w:t xml:space="preserve">Although the survey was open to anyone, the majority of respondents were from Switzerland and academia. The likely cause was that the survey was primarily advertised through the SIB training mailing list and other academic channels and networks within Switzerland. However, academic researchers working in Switzerland are the main target group of SIB training, and the survey results provide valuable insights into the training needs and preferences of bioinformatics researchers. Here, we discuss the overall survey outcomes along the three dimensions of training needs, participation barriers and learning formats.</w:t>
-      </w:r>
-    </w:p>
-    <w:bookmarkStart w:id="51" w:name="training-needs"/>
+        <w:t xml:space="preserve">The majority of respondents were working in Switzerland as an academic researcher, likely because the survey was primarily advertised through the SIB training mailing list and other academic channels and networks within Switzerland. This was a good outcome for the aims of the survey because, academic researchers working in Switzerland are the main target group of SIB training. Nevertheless, we think that the survey results can be at least partially generalized to similar European countries. Here, we discuss the overall survey outcomes along the three dimensions of training needs, participation barriers and learning formats.</w:t>
+      </w:r>
+    </w:p>
+    <w:bookmarkStart w:id="51" w:name="Xbd19bfc40f747e39b38feba064da9cf9f06c1ca"/>
     <w:p>
       <w:pPr>
         <w:pStyle w:val="Heading4"/>
       </w:pPr>
       <w:r>
-        <w:t xml:space="preserve">4.1.1 Training needs</w:t>
+        <w:t xml:space="preserve">4.1.1 A clear need for skills in AI and reproducible research</w:t>
       </w:r>
     </w:p>
     <w:p>
@@ -1991,7 +2106,7 @@
         <w:pStyle w:val="FirstParagraph"/>
       </w:pPr>
       <w:r>
-        <w:t xml:space="preserve">From the complete pool of survey results, it becomes clear that there is a demand for training on using (generative) AI and LLMs. The course that was indicated as most needed was</w:t>
+        <w:t xml:space="preserve">From the complete pool of survey results, it becomes clear that there is a demand for training on using (generative) AI and LLMs. Four of the possible topics related to AI/LLM skills and all of them were in the top six of most needed topics. The two courses that were indicated as most needed were on how to use AI effectively:</w:t>
       </w:r>
       <w:r>
         <w:t xml:space="preserve"> </w:t>
@@ -2009,7 +2124,37 @@
         <w:t xml:space="preserve">“Using large language models (LLM) for biomedical knowledge extraction”</w:t>
       </w:r>
       <w:r>
-        <w:t xml:space="preserve">. This shows that the respondents are aware of the potential of AI and LLMs in bioinformatics and experience a gap in their current skill set on how to use these tools effectively.</w:t>
+        <w:t xml:space="preserve">. A little bit less needed was the topic</w:t>
+      </w:r>
+      <w:r>
+        <w:t xml:space="preserve"> </w:t>
+      </w:r>
+      <w:r>
+        <w:t xml:space="preserve">“Advanced AI techniques (agentic AI, MCP and RAGs)”</w:t>
+      </w:r>
+      <w:r>
+        <w:t xml:space="preserve">, which is more related to developing AI tools. This shows that most respondents are aware of the potential of the use AI and LLMs in their daily work in bioinformatics, but there is a need for training on it. This perceived skill gap in AI and LLMs is a known barrier for the adoption and responsible use of AI in general</w:t>
+      </w:r>
+      <w:r>
+        <w:t xml:space="preserve"> </w:t>
+      </w:r>
+      <w:r>
+        <w:t xml:space="preserve">(Sidhu et al. 2024; Wen Bin Goh et al. 2026)</w:t>
+      </w:r>
+      <w:r>
+        <w:t xml:space="preserve">, and it is reassuring to see that the respondents are aware of this gap and are interested in learning more about it, particulary in the learner profile</w:t>
+      </w:r>
+      <w:r>
+        <w:t xml:space="preserve"> </w:t>
+      </w:r>
+      <w:r>
+        <w:t xml:space="preserve">‘AI and data’</w:t>
+      </w:r>
+      <w:r>
+        <w:t xml:space="preserve"> </w:t>
+      </w:r>
+      <w:r>
+        <w:t xml:space="preserve">(Cluster 1).</w:t>
       </w:r>
     </w:p>
     <w:p>
@@ -2067,7 +2212,16 @@
         <w:pStyle w:val="BodyText"/>
       </w:pPr>
       <w:r>
-        <w:t xml:space="preserve">While applying such outcomes to actual training, it is important to note that there can be a gap between intention - indicating a desire or need for training - and action - actually participating in a training course on the topic. Despite the questions on training needs were phrased in a way that the answer should relate to the respondents’ own training needs (</w:t>
+        <w:t xml:space="preserve">While applying such outcomes to actual curriculum design, it is important to note that there can be a gap between intention - indicating a desire or need for training - and action - actually participating in a training course on the topic, known as the intention-behavior gap</w:t>
+      </w:r>
+      <w:r>
+        <w:t xml:space="preserve"> </w:t>
+      </w:r>
+      <w:r>
+        <w:t xml:space="preserve">(Sheeran and Webb 2016)</w:t>
+      </w:r>
+      <w:r>
+        <w:t xml:space="preserve">. Despite the questions on training needs were phrased in a way that the answer should relate to the respondents’ own training needs (</w:t>
       </w:r>
       <w:r>
         <w:t xml:space="preserve">“.. specify your training needs ..”</w:t>
@@ -2091,7 +2245,7 @@
         <w:pStyle w:val="FirstParagraph"/>
       </w:pPr>
       <w:r>
-        <w:t xml:space="preserve">For most barriers, we saw that the majority of respondents did not perceive them as a barrier or as small barrier to their participation in SIB courses. Distance and course fees were large or critical barriers for a substantial proportion of respondents.</w:t>
+        <w:t xml:space="preserve">For most barriers, we saw that the majority of respondents did not perceive them as a barrier or as small barrier to their participation in SIB courses. However, distance and course fees were large or critical barriers for a substantial proportion of respondents.</w:t>
       </w:r>
     </w:p>
     <w:p>
@@ -2107,17 +2261,17 @@
         <w:pStyle w:val="BodyText"/>
       </w:pPr>
       <w:r>
-        <w:t xml:space="preserve">At the time of writing, participating in a regular SIB course costs CHF 100 (= $ 124) per day, which can be a substantial amount for some researchers, especially if they cannot receive funding from their organisation. Compared to other live courses with a similar target group in Europe (e.g. EMBL-EBI courses, VIB training), this is a moderate fee, and only covers a part of the actual costs. Rearranging the cost model could lower this barrier, but would also mean that either different choices should be made regarding the quality or quantity of courses, or that additional funding is required, e.g. through institutional memberships.</w:t>
+        <w:t xml:space="preserve">At the time of writing, participating in a regular SIB course costs CHF 100 (= $ 124) per day, which can be a substantial amount for some researchers, especially if they cannot receive funding from their organisation. Compared to other live courses with a similar target group in Europe (e.g. EMBL-EBI courses, VIB training), this is a moderate fee, and only covers a part of the actual costs. Rearranging the cost model could lower this barrier, but would also mean that either different choices should be made regarding the quality or quantity of courses, or that additional funding is required.</w:t>
       </w:r>
     </w:p>
     <w:bookmarkEnd w:id="52"/>
-    <w:bookmarkStart w:id="53" w:name="learning-formats"/>
+    <w:bookmarkStart w:id="53" w:name="the-need-for-human-interaction"/>
     <w:p>
       <w:pPr>
         <w:pStyle w:val="Heading4"/>
       </w:pPr>
       <w:r>
-        <w:t xml:space="preserve">4.1.3 Learning formats</w:t>
+        <w:t xml:space="preserve">4.1.3 The need for human interaction</w:t>
       </w:r>
     </w:p>
     <w:p>
@@ -2125,26 +2279,48 @@
         <w:pStyle w:val="FirstParagraph"/>
       </w:pPr>
       <w:r>
-        <w:t xml:space="preserve">Respondents particularly liked short interactive live course formats, and combinations of both live and self-paced learning (blended). This shows the need of the human aspect in courses, such as the interaction between trainers and learners, and between learners themselves.</w:t>
-      </w:r>
-    </w:p>
-    <w:p>
-      <w:pPr>
-        <w:pStyle w:val="BodyText"/>
-      </w:pPr>
-      <w:r>
-        <w:t xml:space="preserve">There was a tendency towards dislike of AI-assisted learning formats, which is interesting given the high demand for training on AI and LLMs. This indicates that while respondents are interested in learning about AI, they prefer to learn in a more traditional format, with human interaction and guidance. How respondents interpreted AI-assisted learning formats is not clear, and could be interpreted in different ways. For example, it could be interpreted as a course where the trainer uses AI to assist in teaching, or as a course where the learners use AI to assist in learning. Implementation of AI-assisted learning formats could be done in different ways, and it is important to understand how learners would appreciate this format, and what their expectations are. Therefore, using AI in courses for the sake of just using AI is not recommended, and it is important to use it only for specific use-cases where it adds clear value.</w:t>
+        <w:t xml:space="preserve">Respondents particularly liked short interactive live course formats, and combinations of both live and self-paced learning (blended). This shows the need of the human aspect in courses, such as the interaction between trainers and learners, and between learners themselves. Despite it being suggested to improve educational outcomes</w:t>
+      </w:r>
+      <w:r>
+        <w:t xml:space="preserve"> </w:t>
+      </w:r>
+      <w:r>
+        <w:t xml:space="preserve">(Dong 2026)</w:t>
+      </w:r>
+      <w:r>
+        <w:t xml:space="preserve">, there was a tendency towards dislike of AI-assisted learning formats, which is interesting given the high demand for training on AI and LLMs. This indicates that while respondents are interested in learning about AI, they prefer to learn in a more traditional format, with human interaction and guidance. This could be explained by overall trust issues regarding AI usage in education</w:t>
+      </w:r>
+      <w:r>
+        <w:t xml:space="preserve"> </w:t>
+      </w:r>
+      <w:r>
+        <w:t xml:space="preserve">(Lelescu et al. 2025)</w:t>
+      </w:r>
+      <w:r>
+        <w:t xml:space="preserve">. We do not know how respondents interpreted what</w:t>
+      </w:r>
+      <w:r>
+        <w:t xml:space="preserve"> </w:t>
+      </w:r>
+      <w:r>
+        <w:t xml:space="preserve">‘AI-assisted learning formats’</w:t>
+      </w:r>
+      <w:r>
+        <w:t xml:space="preserve"> </w:t>
+      </w:r>
+      <w:r>
+        <w:t xml:space="preserve">means. It is therefore important in next steps to understand how learners would appreciate this format, and what their expectations are.</w:t>
       </w:r>
     </w:p>
     <w:bookmarkEnd w:id="53"/>
     <w:bookmarkEnd w:id="54"/>
-    <w:bookmarkStart w:id="55" w:name="learner-profiles-1"/>
+    <w:bookmarkStart w:id="55" w:name="Xb35517a315e76c974aa3df1a4c47fd1b52f9a98"/>
     <w:p>
       <w:pPr>
         <w:pStyle w:val="Heading3"/>
       </w:pPr>
       <w:r>
-        <w:t xml:space="preserve">4.2 Learner profiles</w:t>
+        <w:t xml:space="preserve">4.2 Learner profiles characterize heterogeneous training needs</w:t>
       </w:r>
     </w:p>
     <w:p>
@@ -2152,13 +2328,7 @@
         <w:pStyle w:val="FirstParagraph"/>
       </w:pPr>
       <w:r>
-        <w:t xml:space="preserve">The problems that can be solved with bioinformatics are very diverse, and professionals solving these problems are</w:t>
-      </w:r>
-      <w:r>
-        <w:t xml:space="preserve"> </w:t>
-      </w:r>
-      <w:r>
-        <w:t xml:space="preserve">highly heterogeneous. Therefore, analyzing the survey as a homogeneous group, or slicing the group by demographic indicators only partly captures the diversity of training needs. This issue is not specific to bioinformatics training, creating clusters of respondents is an overall valuable approach for understanding survey data, for example in citizenship norms</w:t>
+        <w:t xml:space="preserve">The problems that can be solved with bioinformatics are very diverse, and professionals solving these problems are highly heterogeneous. Therefore, analyzing the survey as a homogeneous group, or slicing the group by demographic indicators only partly captures the diversity of training needs. This issue is not specific to bioinformatics training, creating clusters of respondents is an overall valuable approach for understanding survey data, for example in citizenship norms</w:t>
       </w:r>
       <w:r>
         <w:t xml:space="preserve"> </w:t>
@@ -2229,7 +2399,7 @@
         <w:t xml:space="preserve"> </w:t>
       </w:r>
       <w:r>
-        <w:t xml:space="preserve">was the 15th most needed topic in the complete pool of respondents, indicating a moderately to low priority to organize a course on the topic. However, it was the first most needed topic in Cluster 2 (Infectious disease genomics). This shows that organising a course on this topic would serve the primary needs of a substantial group of respondents, and this would not be visible when looking at the complete pool of respondents.</w:t>
+        <w:t xml:space="preserve">was the 15th most needed topic in the complete pool of respondents, indicating a moderately to low priority to organize a course on the topic. However, it was the first most needed topic in Cluster 2 (Infectious disease genomics), showing that organising a course on this topic would serve the primary needs of a substantial group of respondents, and this would not be visible when looking at the complete pool of respondents.</w:t>
       </w:r>
     </w:p>
     <w:p>
@@ -2237,12 +2407,12 @@
         <w:pStyle w:val="BodyText"/>
       </w:pPr>
       <w:r>
-        <w:t xml:space="preserve">The clusters also enable a more targeted approach to address barriers to participation, learning formats and demographics. For example, Cluster 1 (AI &amp; Data) has a higher proportion of early-career scientists and a higher proportion of respondents from Swiss universities, while Cluster 4 (Biochemistry, imaging &amp; AI) has a higher proportion of senior scientists and respondents from industry. These differences in demographics can inform the design of training programs that are tailored to the specific needs and preferences of each cluster.</w:t>
+        <w:t xml:space="preserve">The clusters also enable a more targeted approach to address barriers to participation, learning formats and demographics. For example, Cluster 1 (AI &amp; Data) has a higher proportion of early-career scientists and a higher proportion of respondents from Swiss universities, while Cluster 4 (Biochemistry, imaging &amp; AI) has a higher proportion of senior scientists and respondents from industry. These differences in demographics can inform the design of training programs that are tailored to the specific needs and preferences of each learner profile.</w:t>
       </w:r>
     </w:p>
     <w:bookmarkEnd w:id="55"/>
     <w:bookmarkEnd w:id="56"/>
-    <w:bookmarkStart w:id="96" w:name="conclusion"/>
+    <w:bookmarkStart w:id="124" w:name="conclusion"/>
     <w:p>
       <w:pPr>
         <w:pStyle w:val="Heading2"/>
@@ -2259,7 +2429,7 @@
         <w:t xml:space="preserve">This study demonstrates the utility of network modeling and community detection for transforming raw training needs survey data into clear, actionable curriculum design. By grouping respondents based on their shared technical requirements rather than classical demographic labels, we isolated four stable, cohesive learner archetypes. The heavy influence of AI across these clusters—both as a highly requested technical topic and as an overall disliked pedagogical format—underscores the need for agile curriculum design. Tailoring training curricula to these specific learner profiles allows computational biology training providers to effectively address participation barriers, adopt optimal teaching formats, and ensure maximum educational impact in a rapidly evolving scientific landscape.</w:t>
       </w:r>
     </w:p>
-    <w:bookmarkStart w:id="95" w:name="refs"/>
+    <w:bookmarkStart w:id="123" w:name="refs"/>
     <w:bookmarkStart w:id="58" w:name="ref-attwood_global_2019"/>
     <w:p>
       <w:pPr>
@@ -2306,12 +2476,70 @@
       </w:r>
     </w:p>
     <w:bookmarkEnd w:id="58"/>
-    <w:bookmarkStart w:id="60" w:name="ref-blondel_fast_2008"/>
+    <w:bookmarkStart w:id="60" w:name="ref-bewersdorff_taking_2025"/>
     <w:p>
       <w:pPr>
         <w:pStyle w:val="Bibliography"/>
       </w:pPr>
       <w:r>
+        <w:t xml:space="preserve">Bewersdorff, Arne, Christian Hartmann, Marie Hornberger, et al. 2025.</w:t>
+      </w:r>
+      <w:r>
+        <w:t xml:space="preserve"> </w:t>
+      </w:r>
+      <w:r>
+        <w:t xml:space="preserve">“Taking the Next Step with Generative Artificial Intelligence:</w:t>
+      </w:r>
+      <w:r>
+        <w:t xml:space="preserve"> </w:t>
+      </w:r>
+      <w:r>
+        <w:t xml:space="preserve">The</w:t>
+      </w:r>
+      <w:r>
+        <w:t xml:space="preserve"> </w:t>
+      </w:r>
+      <w:r>
+        <w:t xml:space="preserve">Transformative Role of Multimodal Large Language Models in Science Education.”</w:t>
+      </w:r>
+      <w:r>
+        <w:t xml:space="preserve"> </w:t>
+      </w:r>
+      <w:r>
+        <w:rPr>
+          <w:i/>
+          <w:iCs/>
+        </w:rPr>
+        <w:t xml:space="preserve">Learning and Individual Differences</w:t>
+      </w:r>
+      <w:r>
+        <w:t xml:space="preserve"> </w:t>
+      </w:r>
+      <w:r>
+        <w:t xml:space="preserve">118 (February): 102601.</w:t>
+      </w:r>
+      <w:r>
+        <w:t xml:space="preserve"> </w:t>
+      </w:r>
+      <w:hyperlink r:id="rId59">
+        <w:r>
+          <w:rPr>
+            <w:rStyle w:val="Hyperlink"/>
+          </w:rPr>
+          <w:t xml:space="preserve">https://doi.org/10.1016/j.lindif.2024.102601</w:t>
+        </w:r>
+      </w:hyperlink>
+      <w:r>
+        <w:t xml:space="preserve">.</w:t>
+      </w:r>
+    </w:p>
+    <w:bookmarkEnd w:id="60"/>
+    <w:bookmarkStart w:id="62" w:name="ref-blondel_fast_2008"/>
+    <w:p>
+      <w:pPr>
+        <w:pStyle w:val="Bibliography"/>
+      </w:pPr>
+      <w:r>
         <w:t xml:space="preserve">Blondel, Vincent D, Jean-Loup Guillaume, Renaud Lambiotte, and Etienne Lefebvre. 2008.</w:t>
       </w:r>
       <w:r>
@@ -2339,7 +2567,7 @@
       <w:r>
         <w:t xml:space="preserve"> </w:t>
       </w:r>
-      <w:hyperlink r:id="rId59">
+      <w:hyperlink r:id="rId61">
         <w:r>
           <w:rPr>
             <w:rStyle w:val="Hyperlink"/>
@@ -2351,8 +2579,8 @@
         <w:t xml:space="preserve">.</w:t>
       </w:r>
     </w:p>
-    <w:bookmarkEnd w:id="60"/>
-    <w:bookmarkStart w:id="62" w:name="ref-cheng_measuring_2024"/>
+    <w:bookmarkEnd w:id="62"/>
+    <w:bookmarkStart w:id="64" w:name="ref-cheng_measuring_2024"/>
     <w:p>
       <w:pPr>
         <w:pStyle w:val="Bibliography"/>
@@ -2397,7 +2625,7 @@
       <w:r>
         <w:t xml:space="preserve"> </w:t>
       </w:r>
-      <w:hyperlink r:id="rId61">
+      <w:hyperlink r:id="rId63">
         <w:r>
           <w:rPr>
             <w:rStyle w:val="Hyperlink"/>
@@ -2409,8 +2637,8 @@
         <w:t xml:space="preserve">.</w:t>
       </w:r>
     </w:p>
-    <w:bookmarkEnd w:id="62"/>
-    <w:bookmarkStart w:id="64" w:name="ref-chung_are_2020"/>
+    <w:bookmarkEnd w:id="64"/>
+    <w:bookmarkStart w:id="66" w:name="ref-chung_are_2020"/>
     <w:p>
       <w:pPr>
         <w:pStyle w:val="Bibliography"/>
@@ -2455,7 +2683,7 @@
       <w:r>
         <w:t xml:space="preserve"> </w:t>
       </w:r>
-      <w:hyperlink r:id="rId63">
+      <w:hyperlink r:id="rId65">
         <w:r>
           <w:rPr>
             <w:rStyle w:val="Hyperlink"/>
@@ -2467,8 +2695,8 @@
         <w:t xml:space="preserve">.</w:t>
       </w:r>
     </w:p>
-    <w:bookmarkEnd w:id="64"/>
-    <w:bookmarkStart w:id="66" w:name="ref-csardi_igraph_2026"/>
+    <w:bookmarkEnd w:id="66"/>
+    <w:bookmarkStart w:id="68" w:name="ref-csardi_igraph_2026"/>
     <w:p>
       <w:pPr>
         <w:pStyle w:val="Bibliography"/>
@@ -2499,7 +2727,7 @@
       <w:r>
         <w:t xml:space="preserve"> </w:t>
       </w:r>
-      <w:hyperlink r:id="rId65">
+      <w:hyperlink r:id="rId67">
         <w:r>
           <w:rPr>
             <w:rStyle w:val="Hyperlink"/>
@@ -2511,13 +2739,135 @@
         <w:t xml:space="preserve">.</w:t>
       </w:r>
     </w:p>
-    <w:bookmarkEnd w:id="66"/>
-    <w:bookmarkStart w:id="68" w:name="ref-drew_revisiting_2023"/>
+    <w:bookmarkEnd w:id="68"/>
+    <w:bookmarkStart w:id="70" w:name="ref-daepp_ai_2026"/>
     <w:p>
       <w:pPr>
         <w:pStyle w:val="Bibliography"/>
       </w:pPr>
       <w:r>
+        <w:t xml:space="preserve">Daepp, Madeleine I. G., Kiran Tomlinson, Scott Counts, and Siddharth Suri. 2026.</w:t>
+      </w:r>
+      <w:r>
+        <w:t xml:space="preserve"> </w:t>
+      </w:r>
+      <w:r>
+        <w:t xml:space="preserve">“</w:t>
+      </w:r>
+      <w:r>
+        <w:t xml:space="preserve">AI</w:t>
+      </w:r>
+      <w:r>
+        <w:t xml:space="preserve"> </w:t>
+      </w:r>
+      <w:r>
+        <w:t xml:space="preserve">and the Democratization of Knowledge Work.”</w:t>
+      </w:r>
+      <w:r>
+        <w:t xml:space="preserve"> </w:t>
+      </w:r>
+      <w:r>
+        <w:rPr>
+          <w:i/>
+          <w:iCs/>
+        </w:rPr>
+        <w:t xml:space="preserve">Nature Computational Science</w:t>
+      </w:r>
+      <w:r>
+        <w:t xml:space="preserve"> </w:t>
+      </w:r>
+      <w:r>
+        <w:t xml:space="preserve">6 (6): 558–64.</w:t>
+      </w:r>
+      <w:r>
+        <w:t xml:space="preserve"> </w:t>
+      </w:r>
+      <w:hyperlink r:id="rId69">
+        <w:r>
+          <w:rPr>
+            <w:rStyle w:val="Hyperlink"/>
+          </w:rPr>
+          <w:t xml:space="preserve">https://doi.org/10.1038/s43588-026-00985-z</w:t>
+        </w:r>
+      </w:hyperlink>
+      <w:r>
+        <w:t xml:space="preserve">.</w:t>
+      </w:r>
+    </w:p>
+    <w:bookmarkEnd w:id="70"/>
+    <w:bookmarkStart w:id="72" w:name="ref-dong_generative_2026"/>
+    <w:p>
+      <w:pPr>
+        <w:pStyle w:val="Bibliography"/>
+      </w:pPr>
+      <w:r>
+        <w:t xml:space="preserve">Dong, Ying. 2026.</w:t>
+      </w:r>
+      <w:r>
+        <w:t xml:space="preserve"> </w:t>
+      </w:r>
+      <w:r>
+        <w:t xml:space="preserve">“Generative</w:t>
+      </w:r>
+      <w:r>
+        <w:t xml:space="preserve"> </w:t>
+      </w:r>
+      <w:r>
+        <w:t xml:space="preserve">AI</w:t>
+      </w:r>
+      <w:r>
+        <w:t xml:space="preserve"> </w:t>
+      </w:r>
+      <w:r>
+        <w:t xml:space="preserve">Technologies and Educational Outcomes: A Comprehensive Meta-Analysis Comparing Traditional and</w:t>
+      </w:r>
+      <w:r>
+        <w:t xml:space="preserve"> </w:t>
+      </w:r>
+      <w:r>
+        <w:t xml:space="preserve">AI</w:t>
+      </w:r>
+      <w:r>
+        <w:t xml:space="preserve">-Driven Approaches.”</w:t>
+      </w:r>
+      <w:r>
+        <w:t xml:space="preserve"> </w:t>
+      </w:r>
+      <w:r>
+        <w:rPr>
+          <w:i/>
+          <w:iCs/>
+        </w:rPr>
+        <w:t xml:space="preserve">Humanities and Social Sciences Communications</w:t>
+      </w:r>
+      <w:r>
+        <w:t xml:space="preserve"> </w:t>
+      </w:r>
+      <w:r>
+        <w:t xml:space="preserve">13 (1): 559.</w:t>
+      </w:r>
+      <w:r>
+        <w:t xml:space="preserve"> </w:t>
+      </w:r>
+      <w:hyperlink r:id="rId71">
+        <w:r>
+          <w:rPr>
+            <w:rStyle w:val="Hyperlink"/>
+          </w:rPr>
+          <w:t xml:space="preserve">https://doi.org/10.1057/s41599-026-06903-y</w:t>
+        </w:r>
+      </w:hyperlink>
+      <w:r>
+        <w:t xml:space="preserve">.</w:t>
+      </w:r>
+    </w:p>
+    <w:bookmarkEnd w:id="72"/>
+    <w:bookmarkStart w:id="74" w:name="ref-drew_revisiting_2023"/>
+    <w:p>
+      <w:pPr>
+        <w:pStyle w:val="Bibliography"/>
+      </w:pPr>
+      <w:r>
         <w:t xml:space="preserve">Drew, Jennifer, William Morgan, Sebastian Galindo, et al. 2023.</w:t>
       </w:r>
       <w:r>
@@ -2545,7 +2895,7 @@
       <w:r>
         <w:t xml:space="preserve"> </w:t>
       </w:r>
-      <w:hyperlink r:id="rId67">
+      <w:hyperlink r:id="rId73">
         <w:r>
           <w:rPr>
             <w:rStyle w:val="Hyperlink"/>
@@ -2557,13 +2907,247 @@
         <w:t xml:space="preserve">.</w:t>
       </w:r>
     </w:p>
-    <w:bookmarkEnd w:id="68"/>
-    <w:bookmarkStart w:id="70" w:name="ref-hooghe_comparative_2016"/>
+    <w:bookmarkEnd w:id="74"/>
+    <w:bookmarkStart w:id="76" w:name="ref-esiyok_acceptance_2025"/>
     <w:p>
       <w:pPr>
         <w:pStyle w:val="Bibliography"/>
       </w:pPr>
       <w:r>
+        <w:t xml:space="preserve">Esiyok, Elif, Sahin Gokcearslan, and Kemal Gurkan Kucukergin. 2025.</w:t>
+      </w:r>
+      <w:r>
+        <w:t xml:space="preserve"> </w:t>
+      </w:r>
+      <w:r>
+        <w:t xml:space="preserve">“Acceptance of</w:t>
+      </w:r>
+      <w:r>
+        <w:t xml:space="preserve"> </w:t>
+      </w:r>
+      <w:r>
+        <w:t xml:space="preserve">Educational</w:t>
+      </w:r>
+      <w:r>
+        <w:t xml:space="preserve"> </w:t>
+      </w:r>
+      <w:r>
+        <w:t xml:space="preserve">Use</w:t>
+      </w:r>
+      <w:r>
+        <w:t xml:space="preserve"> </w:t>
+      </w:r>
+      <w:r>
+        <w:t xml:space="preserve">of</w:t>
+      </w:r>
+      <w:r>
+        <w:t xml:space="preserve"> </w:t>
+      </w:r>
+      <w:r>
+        <w:t xml:space="preserve">AI</w:t>
+      </w:r>
+      <w:r>
+        <w:t xml:space="preserve"> </w:t>
+      </w:r>
+      <w:r>
+        <w:t xml:space="preserve">Chatbots</w:t>
+      </w:r>
+      <w:r>
+        <w:t xml:space="preserve"> </w:t>
+      </w:r>
+      <w:r>
+        <w:t xml:space="preserve">in the</w:t>
+      </w:r>
+      <w:r>
+        <w:t xml:space="preserve"> </w:t>
+      </w:r>
+      <w:r>
+        <w:t xml:space="preserve">Context</w:t>
+      </w:r>
+      <w:r>
+        <w:t xml:space="preserve"> </w:t>
+      </w:r>
+      <w:r>
+        <w:t xml:space="preserve">of</w:t>
+      </w:r>
+      <w:r>
+        <w:t xml:space="preserve"> </w:t>
+      </w:r>
+      <w:r>
+        <w:t xml:space="preserve">Self</w:t>
+      </w:r>
+      <w:r>
+        <w:t xml:space="preserve">-</w:t>
+      </w:r>
+      <w:r>
+        <w:t xml:space="preserve">Directed</w:t>
+      </w:r>
+      <w:r>
+        <w:t xml:space="preserve"> </w:t>
+      </w:r>
+      <w:r>
+        <w:t xml:space="preserve">Learning</w:t>
+      </w:r>
+      <w:r>
+        <w:t xml:space="preserve"> </w:t>
+      </w:r>
+      <w:r>
+        <w:t xml:space="preserve">with</w:t>
+      </w:r>
+      <w:r>
+        <w:t xml:space="preserve"> </w:t>
+      </w:r>
+      <w:r>
+        <w:t xml:space="preserve">Technology</w:t>
+      </w:r>
+      <w:r>
+        <w:t xml:space="preserve"> </w:t>
+      </w:r>
+      <w:r>
+        <w:t xml:space="preserve">and</w:t>
+      </w:r>
+      <w:r>
+        <w:t xml:space="preserve"> </w:t>
+      </w:r>
+      <w:r>
+        <w:t xml:space="preserve">ICT</w:t>
+      </w:r>
+      <w:r>
+        <w:t xml:space="preserve"> </w:t>
+      </w:r>
+      <w:r>
+        <w:t xml:space="preserve">Self</w:t>
+      </w:r>
+      <w:r>
+        <w:t xml:space="preserve">-</w:t>
+      </w:r>
+      <w:r>
+        <w:t xml:space="preserve">Efficacy</w:t>
+      </w:r>
+      <w:r>
+        <w:t xml:space="preserve"> </w:t>
+      </w:r>
+      <w:r>
+        <w:t xml:space="preserve">of</w:t>
+      </w:r>
+      <w:r>
+        <w:t xml:space="preserve"> </w:t>
+      </w:r>
+      <w:r>
+        <w:t xml:space="preserve">Undergraduate</w:t>
+      </w:r>
+      <w:r>
+        <w:t xml:space="preserve"> </w:t>
+      </w:r>
+      <w:r>
+        <w:t xml:space="preserve">Students</w:t>
+      </w:r>
+      <w:r>
+        <w:t xml:space="preserve">.”</w:t>
+      </w:r>
+      <w:r>
+        <w:t xml:space="preserve"> </w:t>
+      </w:r>
+      <w:r>
+        <w:rPr>
+          <w:i/>
+          <w:iCs/>
+        </w:rPr>
+        <w:t xml:space="preserve">International Journal of Human–Computer Interaction</w:t>
+      </w:r>
+      <w:r>
+        <w:t xml:space="preserve"> </w:t>
+      </w:r>
+      <w:r>
+        <w:t xml:space="preserve">41 (1): 641–50.</w:t>
+      </w:r>
+      <w:r>
+        <w:t xml:space="preserve"> </w:t>
+      </w:r>
+      <w:hyperlink r:id="rId75">
+        <w:r>
+          <w:rPr>
+            <w:rStyle w:val="Hyperlink"/>
+          </w:rPr>
+          <w:t xml:space="preserve">https://doi.org/10.1080/10447318.2024.2303557</w:t>
+        </w:r>
+      </w:hyperlink>
+      <w:r>
+        <w:t xml:space="preserve">.</w:t>
+      </w:r>
+    </w:p>
+    <w:bookmarkEnd w:id="76"/>
+    <w:bookmarkStart w:id="78" w:name="ref-geest_community_2026"/>
+    <w:p>
+      <w:pPr>
+        <w:pStyle w:val="Bibliography"/>
+      </w:pPr>
+      <w:r>
+        <w:t xml:space="preserve">Geest, Geert van, Daniel Thomas-Lopez, Anna A. Feitzinger, et al. 2026.</w:t>
+      </w:r>
+      <w:r>
+        <w:t xml:space="preserve"> </w:t>
+      </w:r>
+      <w:r>
+        <w:rPr>
+          <w:i/>
+          <w:iCs/>
+        </w:rPr>
+        <w:t xml:space="preserve">Community Needs for</w:t>
+      </w:r>
+      <w:r>
+        <w:rPr>
+          <w:i/>
+          <w:iCs/>
+        </w:rPr>
+        <w:t xml:space="preserve"> </w:t>
+      </w:r>
+      <w:r>
+        <w:rPr>
+          <w:i/>
+          <w:iCs/>
+        </w:rPr>
+        <w:t xml:space="preserve">FAIR</w:t>
+      </w:r>
+      <w:r>
+        <w:rPr>
+          <w:i/>
+          <w:iCs/>
+        </w:rPr>
+        <w:t xml:space="preserve"> </w:t>
+      </w:r>
+      <w:r>
+        <w:rPr>
+          <w:i/>
+          <w:iCs/>
+        </w:rPr>
+        <w:t xml:space="preserve">Pathogen Data</w:t>
+      </w:r>
+      <w:r>
+        <w:t xml:space="preserve">. bioRxiv.</w:t>
+      </w:r>
+      <w:r>
+        <w:t xml:space="preserve"> </w:t>
+      </w:r>
+      <w:hyperlink r:id="rId77">
+        <w:r>
+          <w:rPr>
+            <w:rStyle w:val="Hyperlink"/>
+          </w:rPr>
+          <w:t xml:space="preserve">https://doi.org/10.64898/2026.04.14.718420</w:t>
+        </w:r>
+      </w:hyperlink>
+      <w:r>
+        <w:t xml:space="preserve">.</w:t>
+      </w:r>
+    </w:p>
+    <w:bookmarkEnd w:id="78"/>
+    <w:bookmarkStart w:id="80" w:name="ref-hooghe_comparative_2016"/>
+    <w:p>
+      <w:pPr>
+        <w:pStyle w:val="Bibliography"/>
+      </w:pPr>
+      <w:r>
         <w:t xml:space="preserve">Hooghe, Marc, Jennifer Oser, and Sofie Marien. 2016.</w:t>
       </w:r>
       <w:r>
@@ -2612,7 +3196,7 @@
       <w:r>
         <w:t xml:space="preserve"> </w:t>
       </w:r>
-      <w:hyperlink r:id="rId69">
+      <w:hyperlink r:id="rId79">
         <w:r>
           <w:rPr>
             <w:rStyle w:val="Hyperlink"/>
@@ -2624,8 +3208,8 @@
         <w:t xml:space="preserve">.</w:t>
       </w:r>
     </w:p>
-    <w:bookmarkEnd w:id="70"/>
-    <w:bookmarkStart w:id="72" w:name="ref-hyde_electronic_2019"/>
+    <w:bookmarkEnd w:id="80"/>
+    <w:bookmarkStart w:id="82" w:name="ref-hyde_electronic_2019"/>
     <w:p>
       <w:pPr>
         <w:pStyle w:val="Bibliography"/>
@@ -2748,7 +3332,7 @@
       <w:r>
         <w:t xml:space="preserve"> </w:t>
       </w:r>
-      <w:hyperlink r:id="rId71">
+      <w:hyperlink r:id="rId81">
         <w:r>
           <w:rPr>
             <w:rStyle w:val="Hyperlink"/>
@@ -2760,8 +3344,8 @@
         <w:t xml:space="preserve">.</w:t>
       </w:r>
     </w:p>
-    <w:bookmarkEnd w:id="72"/>
-    <w:bookmarkStart w:id="74" w:name="ref-jiang_survey_2026"/>
+    <w:bookmarkEnd w:id="82"/>
+    <w:bookmarkStart w:id="84" w:name="ref-jiang_survey_2026"/>
     <w:p>
       <w:pPr>
         <w:pStyle w:val="Bibliography"/>
@@ -2845,7 +3429,7 @@
       <w:r>
         <w:t xml:space="preserve"> </w:t>
       </w:r>
-      <w:hyperlink r:id="rId73">
+      <w:hyperlink r:id="rId83">
         <w:r>
           <w:rPr>
             <w:rStyle w:val="Hyperlink"/>
@@ -2857,8 +3441,8 @@
         <w:t xml:space="preserve">.</w:t>
       </w:r>
     </w:p>
-    <w:bookmarkEnd w:id="74"/>
-    <w:bookmarkStart w:id="76" w:name="ref-kersloot_perceptions_2022"/>
+    <w:bookmarkEnd w:id="84"/>
+    <w:bookmarkStart w:id="86" w:name="ref-kersloot_perceptions_2022"/>
     <w:p>
       <w:pPr>
         <w:pStyle w:val="Bibliography"/>
@@ -2900,7 +3484,7 @@
       <w:r>
         <w:t xml:space="preserve"> </w:t>
       </w:r>
-      <w:hyperlink r:id="rId75">
+      <w:hyperlink r:id="rId85">
         <w:r>
           <w:rPr>
             <w:rStyle w:val="Hyperlink"/>
@@ -2912,13 +3496,71 @@
         <w:t xml:space="preserve">.</w:t>
       </w:r>
     </w:p>
-    <w:bookmarkEnd w:id="76"/>
-    <w:bookmarkStart w:id="78" w:name="ref-martinez-garcia_fair_2023"/>
+    <w:bookmarkEnd w:id="86"/>
+    <w:bookmarkStart w:id="88" w:name="ref-lelescu_exploring_2025"/>
     <w:p>
       <w:pPr>
         <w:pStyle w:val="Bibliography"/>
       </w:pPr>
       <w:r>
+        <w:t xml:space="preserve">Lelescu, Ana, Simona Sava, Gabriela Grosseck, and Laura Malita. 2025.</w:t>
+      </w:r>
+      <w:r>
+        <w:t xml:space="preserve"> </w:t>
+      </w:r>
+      <w:r>
+        <w:t xml:space="preserve">“Exploring Trust in Generative</w:t>
+      </w:r>
+      <w:r>
+        <w:t xml:space="preserve"> </w:t>
+      </w:r>
+      <w:r>
+        <w:t xml:space="preserve">AI</w:t>
+      </w:r>
+      <w:r>
+        <w:t xml:space="preserve"> </w:t>
+      </w:r>
+      <w:r>
+        <w:t xml:space="preserve">for Higher Education Institutions: A Systematic Literature Review Focused on Educators.”</w:t>
+      </w:r>
+      <w:r>
+        <w:t xml:space="preserve"> </w:t>
+      </w:r>
+      <w:r>
+        <w:rPr>
+          <w:i/>
+          <w:iCs/>
+        </w:rPr>
+        <w:t xml:space="preserve">Humanities and Social Sciences Communications</w:t>
+      </w:r>
+      <w:r>
+        <w:t xml:space="preserve"> </w:t>
+      </w:r>
+      <w:r>
+        <w:t xml:space="preserve">12 (1): 1961.</w:t>
+      </w:r>
+      <w:r>
+        <w:t xml:space="preserve"> </w:t>
+      </w:r>
+      <w:hyperlink r:id="rId87">
+        <w:r>
+          <w:rPr>
+            <w:rStyle w:val="Hyperlink"/>
+          </w:rPr>
+          <w:t xml:space="preserve">https://doi.org/10.1057/s41599-025-06253-1</w:t>
+        </w:r>
+      </w:hyperlink>
+      <w:r>
+        <w:t xml:space="preserve">.</w:t>
+      </w:r>
+    </w:p>
+    <w:bookmarkEnd w:id="88"/>
+    <w:bookmarkStart w:id="90" w:name="ref-martinez-garcia_fair_2023"/>
+    <w:p>
+      <w:pPr>
+        <w:pStyle w:val="Bibliography"/>
+      </w:pPr>
+      <w:r>
         <w:t xml:space="preserve">Martínez-García, Alicia, Celia Alvarez-Romero, Esther Román-Villarán, Máximo Bernabeu-Wittel, and Carlos Luis Parra-Calderón. 2023.</w:t>
       </w:r>
       <w:r>
@@ -2955,7 +3597,7 @@
       <w:r>
         <w:t xml:space="preserve"> </w:t>
       </w:r>
-      <w:hyperlink r:id="rId77">
+      <w:hyperlink r:id="rId89">
         <w:r>
           <w:rPr>
             <w:rStyle w:val="Hyperlink"/>
@@ -2967,8 +3609,8 @@
         <w:t xml:space="preserve">.</w:t>
       </w:r>
     </w:p>
-    <w:bookmarkEnd w:id="78"/>
-    <w:bookmarkStart w:id="80" w:name="ref-punj_cluster_1983"/>
+    <w:bookmarkEnd w:id="90"/>
+    <w:bookmarkStart w:id="92" w:name="ref-punj_cluster_1983"/>
     <w:p>
       <w:pPr>
         <w:pStyle w:val="Bibliography"/>
@@ -3061,7 +3703,7 @@
       <w:r>
         <w:t xml:space="preserve"> </w:t>
       </w:r>
-      <w:hyperlink r:id="rId79">
+      <w:hyperlink r:id="rId91">
         <w:r>
           <w:rPr>
             <w:rStyle w:val="Hyperlink"/>
@@ -3073,8 +3715,8 @@
         <w:t xml:space="preserve">.</w:t>
       </w:r>
     </w:p>
-    <w:bookmarkEnd w:id="80"/>
-    <w:bookmarkStart w:id="82" w:name="ref-rcoreteam_r_2026"/>
+    <w:bookmarkEnd w:id="92"/>
+    <w:bookmarkStart w:id="94" w:name="ref-rcoreteam_r_2026"/>
     <w:p>
       <w:pPr>
         <w:pStyle w:val="Bibliography"/>
@@ -3098,7 +3740,7 @@
       <w:r>
         <w:t xml:space="preserve"> </w:t>
       </w:r>
-      <w:hyperlink r:id="rId81">
+      <w:hyperlink r:id="rId93">
         <w:r>
           <w:rPr>
             <w:rStyle w:val="Hyperlink"/>
@@ -3110,13 +3752,83 @@
         <w:t xml:space="preserve">.</w:t>
       </w:r>
     </w:p>
-    <w:bookmarkEnd w:id="82"/>
-    <w:bookmarkStart w:id="84" w:name="ref-ruan_large_2026"/>
+    <w:bookmarkEnd w:id="94"/>
+    <w:bookmarkStart w:id="96" w:name="ref-rocha_past_2022"/>
     <w:p>
       <w:pPr>
         <w:pStyle w:val="Bibliography"/>
       </w:pPr>
       <w:r>
+        <w:t xml:space="preserve">Rocha, Mariana, Luisa Massarani, Sandro José De Souza, and Ana Tereza R. De Vasconcelos. 2022.</w:t>
+      </w:r>
+      <w:r>
+        <w:t xml:space="preserve"> </w:t>
+      </w:r>
+      <w:r>
+        <w:t xml:space="preserve">“The Past, Present and Future of Genomics and Bioinformatics:</w:t>
+      </w:r>
+      <w:r>
+        <w:t xml:space="preserve"> </w:t>
+      </w:r>
+      <w:r>
+        <w:t xml:space="preserve">A</w:t>
+      </w:r>
+      <w:r>
+        <w:t xml:space="preserve"> </w:t>
+      </w:r>
+      <w:r>
+        <w:t xml:space="preserve">Survey of</w:t>
+      </w:r>
+      <w:r>
+        <w:t xml:space="preserve"> </w:t>
+      </w:r>
+      <w:r>
+        <w:t xml:space="preserve">Brazilian</w:t>
+      </w:r>
+      <w:r>
+        <w:t xml:space="preserve"> </w:t>
+      </w:r>
+      <w:r>
+        <w:t xml:space="preserve">Scientists.”</w:t>
+      </w:r>
+      <w:r>
+        <w:t xml:space="preserve"> </w:t>
+      </w:r>
+      <w:r>
+        <w:rPr>
+          <w:i/>
+          <w:iCs/>
+        </w:rPr>
+        <w:t xml:space="preserve">Genetics and Molecular Biology</w:t>
+      </w:r>
+      <w:r>
+        <w:t xml:space="preserve"> </w:t>
+      </w:r>
+      <w:r>
+        <w:t xml:space="preserve">45 (2): e20210354.</w:t>
+      </w:r>
+      <w:r>
+        <w:t xml:space="preserve"> </w:t>
+      </w:r>
+      <w:hyperlink r:id="rId95">
+        <w:r>
+          <w:rPr>
+            <w:rStyle w:val="Hyperlink"/>
+          </w:rPr>
+          <w:t xml:space="preserve">https://doi.org/10.1590/1678-4685-gmb-2021-0354</w:t>
+        </w:r>
+      </w:hyperlink>
+      <w:r>
+        <w:t xml:space="preserve">.</w:t>
+      </w:r>
+    </w:p>
+    <w:bookmarkEnd w:id="96"/>
+    <w:bookmarkStart w:id="98" w:name="ref-ruan_large_2026"/>
+    <w:p>
+      <w:pPr>
+        <w:pStyle w:val="Bibliography"/>
+      </w:pPr>
+      <w:r>
         <w:t xml:space="preserve">Ruan, Wei, Yanjun Lyu, Jing Zhang, et al. 2026.</w:t>
       </w:r>
       <w:r>
@@ -3144,7 +3856,7 @@
       <w:r>
         <w:t xml:space="preserve"> </w:t>
       </w:r>
-      <w:hyperlink r:id="rId83">
+      <w:hyperlink r:id="rId97">
         <w:r>
           <w:rPr>
             <w:rStyle w:val="Hyperlink"/>
@@ -3156,13 +3868,640 @@
         <w:t xml:space="preserve">.</w:t>
       </w:r>
     </w:p>
-    <w:bookmarkEnd w:id="84"/>
-    <w:bookmarkStart w:id="86" w:name="ref-via_ten_2011"/>
+    <w:bookmarkEnd w:id="98"/>
+    <w:bookmarkStart w:id="100" w:name="ref-sangeda_baseline_2021"/>
     <w:p>
       <w:pPr>
         <w:pStyle w:val="Bibliography"/>
       </w:pPr>
       <w:r>
+        <w:t xml:space="preserve">Sangeda, Raphael Zozimus, Aneth David Mwakilili, Upendo Masamu, et al. 2021.</w:t>
+      </w:r>
+      <w:r>
+        <w:t xml:space="preserve"> </w:t>
+      </w:r>
+      <w:r>
+        <w:t xml:space="preserve">“A</w:t>
+      </w:r>
+      <w:r>
+        <w:t xml:space="preserve"> </w:t>
+      </w:r>
+      <w:r>
+        <w:t xml:space="preserve">Baseline</w:t>
+      </w:r>
+      <w:r>
+        <w:t xml:space="preserve"> </w:t>
+      </w:r>
+      <w:r>
+        <w:t xml:space="preserve">Evaluation</w:t>
+      </w:r>
+      <w:r>
+        <w:t xml:space="preserve"> </w:t>
+      </w:r>
+      <w:r>
+        <w:t xml:space="preserve">of</w:t>
+      </w:r>
+      <w:r>
+        <w:t xml:space="preserve"> </w:t>
+      </w:r>
+      <w:r>
+        <w:t xml:space="preserve">Bioinformatics</w:t>
+      </w:r>
+      <w:r>
+        <w:t xml:space="preserve"> </w:t>
+      </w:r>
+      <w:r>
+        <w:t xml:space="preserve">Capacity</w:t>
+      </w:r>
+      <w:r>
+        <w:t xml:space="preserve"> </w:t>
+      </w:r>
+      <w:r>
+        <w:t xml:space="preserve">in</w:t>
+      </w:r>
+      <w:r>
+        <w:t xml:space="preserve"> </w:t>
+      </w:r>
+      <w:r>
+        <w:t xml:space="preserve">Tanzania</w:t>
+      </w:r>
+      <w:r>
+        <w:t xml:space="preserve"> </w:t>
+      </w:r>
+      <w:r>
+        <w:t xml:space="preserve">Reveals</w:t>
+      </w:r>
+      <w:r>
+        <w:t xml:space="preserve"> </w:t>
+      </w:r>
+      <w:r>
+        <w:t xml:space="preserve">Areas</w:t>
+      </w:r>
+      <w:r>
+        <w:t xml:space="preserve"> </w:t>
+      </w:r>
+      <w:r>
+        <w:t xml:space="preserve">for</w:t>
+      </w:r>
+      <w:r>
+        <w:t xml:space="preserve"> </w:t>
+      </w:r>
+      <w:r>
+        <w:t xml:space="preserve">Training</w:t>
+      </w:r>
+      <w:r>
+        <w:t xml:space="preserve">.”</w:t>
+      </w:r>
+      <w:r>
+        <w:t xml:space="preserve"> </w:t>
+      </w:r>
+      <w:r>
+        <w:rPr>
+          <w:i/>
+          <w:iCs/>
+        </w:rPr>
+        <w:t xml:space="preserve">Frontiers in</w:t>
+      </w:r>
+      <w:r>
+        <w:rPr>
+          <w:i/>
+          <w:iCs/>
+        </w:rPr>
+        <w:t xml:space="preserve"> </w:t>
+      </w:r>
+      <w:r>
+        <w:rPr>
+          <w:i/>
+          <w:iCs/>
+        </w:rPr>
+        <w:t xml:space="preserve">Education</w:t>
+      </w:r>
+      <w:r>
+        <w:t xml:space="preserve"> </w:t>
+      </w:r>
+      <w:r>
+        <w:t xml:space="preserve">6 (June): 665313.</w:t>
+      </w:r>
+      <w:r>
+        <w:t xml:space="preserve"> </w:t>
+      </w:r>
+      <w:hyperlink r:id="rId99">
+        <w:r>
+          <w:rPr>
+            <w:rStyle w:val="Hyperlink"/>
+          </w:rPr>
+          <w:t xml:space="preserve">https://doi.org/10.3389/feduc.2021.665313</w:t>
+        </w:r>
+      </w:hyperlink>
+      <w:r>
+        <w:t xml:space="preserve">.</w:t>
+      </w:r>
+    </w:p>
+    <w:bookmarkEnd w:id="100"/>
+    <w:bookmarkStart w:id="102" w:name="ref-sheeran_intentionbehavior_2016"/>
+    <w:p>
+      <w:pPr>
+        <w:pStyle w:val="Bibliography"/>
+      </w:pPr>
+      <w:r>
+        <w:t xml:space="preserve">Sheeran, Paschal, and Thomas L. Webb. 2016.</w:t>
+      </w:r>
+      <w:r>
+        <w:t xml:space="preserve"> </w:t>
+      </w:r>
+      <w:r>
+        <w:t xml:space="preserve">“The</w:t>
+      </w:r>
+      <w:r>
+        <w:t xml:space="preserve"> </w:t>
+      </w:r>
+      <w:r>
+        <w:t xml:space="preserve">Intention</w:t>
+      </w:r>
+      <w:r>
+        <w:t xml:space="preserve">–</w:t>
+      </w:r>
+      <w:r>
+        <w:t xml:space="preserve">Behavior</w:t>
+      </w:r>
+      <w:r>
+        <w:t xml:space="preserve"> </w:t>
+      </w:r>
+      <w:r>
+        <w:t xml:space="preserve">Gap</w:t>
+      </w:r>
+      <w:r>
+        <w:t xml:space="preserve">.”</w:t>
+      </w:r>
+      <w:r>
+        <w:t xml:space="preserve"> </w:t>
+      </w:r>
+      <w:r>
+        <w:rPr>
+          <w:i/>
+          <w:iCs/>
+        </w:rPr>
+        <w:t xml:space="preserve">Social and Personality Psychology Compass</w:t>
+      </w:r>
+      <w:r>
+        <w:t xml:space="preserve"> </w:t>
+      </w:r>
+      <w:r>
+        <w:t xml:space="preserve">10 (9): 503–18.</w:t>
+      </w:r>
+      <w:r>
+        <w:t xml:space="preserve"> </w:t>
+      </w:r>
+      <w:hyperlink r:id="rId101">
+        <w:r>
+          <w:rPr>
+            <w:rStyle w:val="Hyperlink"/>
+          </w:rPr>
+          <w:t xml:space="preserve">https://doi.org/10.1111/spc3.12265</w:t>
+        </w:r>
+      </w:hyperlink>
+      <w:r>
+        <w:t xml:space="preserve">.</w:t>
+      </w:r>
+    </w:p>
+    <w:bookmarkEnd w:id="102"/>
+    <w:bookmarkStart w:id="104" w:name="ref-sidhu_ai_2024"/>
+    <w:p>
+      <w:pPr>
+        <w:pStyle w:val="Bibliography"/>
+      </w:pPr>
+      <w:r>
+        <w:t xml:space="preserve">Sidhu, Gursahildeep Singh, Md Abu Sayem, Nazifa Taslima, Ahmed Selim Anwar, Fariba Chowdhury, and Manataka Rowshon. 2024.</w:t>
+      </w:r>
+      <w:r>
+        <w:t xml:space="preserve"> </w:t>
+      </w:r>
+      <w:r>
+        <w:t xml:space="preserve">“</w:t>
+      </w:r>
+      <w:r>
+        <w:t xml:space="preserve">AI</w:t>
+      </w:r>
+      <w:r>
+        <w:t xml:space="preserve"> </w:t>
+      </w:r>
+      <w:r>
+        <w:t xml:space="preserve">AND</w:t>
+      </w:r>
+      <w:r>
+        <w:t xml:space="preserve"> </w:t>
+      </w:r>
+      <w:r>
+        <w:t xml:space="preserve">WORKFORCE</w:t>
+      </w:r>
+      <w:r>
+        <w:t xml:space="preserve"> </w:t>
+      </w:r>
+      <w:r>
+        <w:t xml:space="preserve">DEVELOPMENT</w:t>
+      </w:r>
+      <w:r>
+        <w:t xml:space="preserve">:</w:t>
+      </w:r>
+      <w:r>
+        <w:t xml:space="preserve"> </w:t>
+      </w:r>
+      <w:r>
+        <w:t xml:space="preserve">A</w:t>
+      </w:r>
+      <w:r>
+        <w:t xml:space="preserve"> </w:t>
+      </w:r>
+      <w:r>
+        <w:t xml:space="preserve">COMPARATIVE</w:t>
+      </w:r>
+      <w:r>
+        <w:t xml:space="preserve"> </w:t>
+      </w:r>
+      <w:r>
+        <w:t xml:space="preserve">ANALYSIS</w:t>
+      </w:r>
+      <w:r>
+        <w:t xml:space="preserve"> </w:t>
+      </w:r>
+      <w:r>
+        <w:t xml:space="preserve">OF</w:t>
+      </w:r>
+      <w:r>
+        <w:t xml:space="preserve"> </w:t>
+      </w:r>
+      <w:r>
+        <w:t xml:space="preserve">SKILL</w:t>
+      </w:r>
+      <w:r>
+        <w:t xml:space="preserve"> </w:t>
+      </w:r>
+      <w:r>
+        <w:t xml:space="preserve">GAPS</w:t>
+      </w:r>
+      <w:r>
+        <w:t xml:space="preserve"> </w:t>
+      </w:r>
+      <w:r>
+        <w:t xml:space="preserve">AND</w:t>
+      </w:r>
+      <w:r>
+        <w:t xml:space="preserve"> </w:t>
+      </w:r>
+      <w:r>
+        <w:t xml:space="preserve">TRAINING</w:t>
+      </w:r>
+      <w:r>
+        <w:t xml:space="preserve"> </w:t>
+      </w:r>
+      <w:r>
+        <w:t xml:space="preserve">NEEDS</w:t>
+      </w:r>
+      <w:r>
+        <w:t xml:space="preserve"> </w:t>
+      </w:r>
+      <w:r>
+        <w:t xml:space="preserve">IN</w:t>
+      </w:r>
+      <w:r>
+        <w:t xml:space="preserve"> </w:t>
+      </w:r>
+      <w:r>
+        <w:t xml:space="preserve">EMERGING</w:t>
+      </w:r>
+      <w:r>
+        <w:t xml:space="preserve"> </w:t>
+      </w:r>
+      <w:r>
+        <w:t xml:space="preserve">ECONOMIES</w:t>
+      </w:r>
+      <w:r>
+        <w:t xml:space="preserve">.”</w:t>
+      </w:r>
+      <w:r>
+        <w:t xml:space="preserve"> </w:t>
+      </w:r>
+      <w:r>
+        <w:rPr>
+          <w:i/>
+          <w:iCs/>
+        </w:rPr>
+        <w:t xml:space="preserve">International Journal of Business and Management Sciences</w:t>
+      </w:r>
+      <w:r>
+        <w:t xml:space="preserve"> </w:t>
+      </w:r>
+      <w:r>
+        <w:t xml:space="preserve">4 (08): 12–28.</w:t>
+      </w:r>
+      <w:r>
+        <w:t xml:space="preserve"> </w:t>
+      </w:r>
+      <w:hyperlink r:id="rId103">
+        <w:r>
+          <w:rPr>
+            <w:rStyle w:val="Hyperlink"/>
+          </w:rPr>
+          <w:t xml:space="preserve">https://doi.org/10.55640/ijbms-04-08-03</w:t>
+        </w:r>
+      </w:hyperlink>
+      <w:r>
+        <w:t xml:space="preserve">.</w:t>
+      </w:r>
+    </w:p>
+    <w:bookmarkEnd w:id="104"/>
+    <w:bookmarkStart w:id="106" w:name="ref-sima_potential_2023"/>
+    <w:p>
+      <w:pPr>
+        <w:pStyle w:val="Bibliography"/>
+      </w:pPr>
+      <w:r>
+        <w:t xml:space="preserve">Sima, Ana-Claudia, and Tarcisio Mendes de Farias. 2023.</w:t>
+      </w:r>
+      <w:r>
+        <w:t xml:space="preserve"> </w:t>
+      </w:r>
+      <w:r>
+        <w:rPr>
+          <w:i/>
+          <w:iCs/>
+        </w:rPr>
+        <w:t xml:space="preserve">On the</w:t>
+      </w:r>
+      <w:r>
+        <w:rPr>
+          <w:i/>
+          <w:iCs/>
+        </w:rPr>
+        <w:t xml:space="preserve"> </w:t>
+      </w:r>
+      <w:r>
+        <w:rPr>
+          <w:i/>
+          <w:iCs/>
+        </w:rPr>
+        <w:t xml:space="preserve">Potential</w:t>
+      </w:r>
+      <w:r>
+        <w:rPr>
+          <w:i/>
+          <w:iCs/>
+        </w:rPr>
+        <w:t xml:space="preserve"> </w:t>
+      </w:r>
+      <w:r>
+        <w:rPr>
+          <w:i/>
+          <w:iCs/>
+        </w:rPr>
+        <w:t xml:space="preserve">of</w:t>
+      </w:r>
+      <w:r>
+        <w:rPr>
+          <w:i/>
+          <w:iCs/>
+        </w:rPr>
+        <w:t xml:space="preserve"> </w:t>
+      </w:r>
+      <w:r>
+        <w:rPr>
+          <w:i/>
+          <w:iCs/>
+        </w:rPr>
+        <w:t xml:space="preserve">Artificial</w:t>
+      </w:r>
+      <w:r>
+        <w:rPr>
+          <w:i/>
+          <w:iCs/>
+        </w:rPr>
+        <w:t xml:space="preserve"> </w:t>
+      </w:r>
+      <w:r>
+        <w:rPr>
+          <w:i/>
+          <w:iCs/>
+        </w:rPr>
+        <w:t xml:space="preserve">Intelligence</w:t>
+      </w:r>
+      <w:r>
+        <w:rPr>
+          <w:i/>
+          <w:iCs/>
+        </w:rPr>
+        <w:t xml:space="preserve"> </w:t>
+      </w:r>
+      <w:r>
+        <w:rPr>
+          <w:i/>
+          <w:iCs/>
+        </w:rPr>
+        <w:t xml:space="preserve">Chatbots</w:t>
+      </w:r>
+      <w:r>
+        <w:rPr>
+          <w:i/>
+          <w:iCs/>
+        </w:rPr>
+        <w:t xml:space="preserve"> </w:t>
+      </w:r>
+      <w:r>
+        <w:rPr>
+          <w:i/>
+          <w:iCs/>
+        </w:rPr>
+        <w:t xml:space="preserve">for</w:t>
+      </w:r>
+      <w:r>
+        <w:rPr>
+          <w:i/>
+          <w:iCs/>
+        </w:rPr>
+        <w:t xml:space="preserve"> </w:t>
+      </w:r>
+      <w:r>
+        <w:rPr>
+          <w:i/>
+          <w:iCs/>
+        </w:rPr>
+        <w:t xml:space="preserve">Data</w:t>
+      </w:r>
+      <w:r>
+        <w:rPr>
+          <w:i/>
+          <w:iCs/>
+        </w:rPr>
+        <w:t xml:space="preserve"> </w:t>
+      </w:r>
+      <w:r>
+        <w:rPr>
+          <w:i/>
+          <w:iCs/>
+        </w:rPr>
+        <w:t xml:space="preserve">Exploration</w:t>
+      </w:r>
+      <w:r>
+        <w:rPr>
+          <w:i/>
+          <w:iCs/>
+        </w:rPr>
+        <w:t xml:space="preserve"> </w:t>
+      </w:r>
+      <w:r>
+        <w:rPr>
+          <w:i/>
+          <w:iCs/>
+        </w:rPr>
+        <w:t xml:space="preserve">of</w:t>
+      </w:r>
+      <w:r>
+        <w:rPr>
+          <w:i/>
+          <w:iCs/>
+        </w:rPr>
+        <w:t xml:space="preserve"> </w:t>
+      </w:r>
+      <w:r>
+        <w:rPr>
+          <w:i/>
+          <w:iCs/>
+        </w:rPr>
+        <w:t xml:space="preserve">Federated</w:t>
+      </w:r>
+      <w:r>
+        <w:rPr>
+          <w:i/>
+          <w:iCs/>
+        </w:rPr>
+        <w:t xml:space="preserve"> </w:t>
+      </w:r>
+      <w:r>
+        <w:rPr>
+          <w:i/>
+          <w:iCs/>
+        </w:rPr>
+        <w:t xml:space="preserve">Bioinformatics</w:t>
+      </w:r>
+      <w:r>
+        <w:rPr>
+          <w:i/>
+          <w:iCs/>
+        </w:rPr>
+        <w:t xml:space="preserve"> </w:t>
+      </w:r>
+      <w:r>
+        <w:rPr>
+          <w:i/>
+          <w:iCs/>
+        </w:rPr>
+        <w:t xml:space="preserve">Knowledge</w:t>
+      </w:r>
+      <w:r>
+        <w:rPr>
+          <w:i/>
+          <w:iCs/>
+        </w:rPr>
+        <w:t xml:space="preserve"> </w:t>
+      </w:r>
+      <w:r>
+        <w:rPr>
+          <w:i/>
+          <w:iCs/>
+        </w:rPr>
+        <w:t xml:space="preserve">Graphs</w:t>
+      </w:r>
+      <w:r>
+        <w:t xml:space="preserve">. arXiv.</w:t>
+      </w:r>
+      <w:r>
+        <w:t xml:space="preserve"> </w:t>
+      </w:r>
+      <w:hyperlink r:id="rId105">
+        <w:r>
+          <w:rPr>
+            <w:rStyle w:val="Hyperlink"/>
+          </w:rPr>
+          <w:t xml:space="preserve">https://doi.org/10.48550/arXiv.2304.10427</w:t>
+        </w:r>
+      </w:hyperlink>
+      <w:r>
+        <w:t xml:space="preserve">.</w:t>
+      </w:r>
+    </w:p>
+    <w:bookmarkEnd w:id="106"/>
+    <w:bookmarkStart w:id="108" w:name="ref-velozo_mapping_2024"/>
+    <w:p>
+      <w:pPr>
+        <w:pStyle w:val="Bibliography"/>
+      </w:pPr>
+      <w:r>
+        <w:t xml:space="preserve">Velozo, Bernardo, Clara Carvalho, Rayssa Feitosa, et al. 2024.</w:t>
+      </w:r>
+      <w:r>
+        <w:t xml:space="preserve"> </w:t>
+      </w:r>
+      <w:r>
+        <w:t xml:space="preserve">“Mapping Educational Needs in Bioinformatics in</w:t>
+      </w:r>
+      <w:r>
+        <w:t xml:space="preserve"> </w:t>
+      </w:r>
+      <w:r>
+        <w:t xml:space="preserve">Brazil</w:t>
+      </w:r>
+      <w:r>
+        <w:t xml:space="preserve">: Adapting</w:t>
+      </w:r>
+      <w:r>
+        <w:t xml:space="preserve"> </w:t>
+      </w:r>
+      <w:r>
+        <w:t xml:space="preserve">ISCB</w:t>
+      </w:r>
+      <w:r>
+        <w:t xml:space="preserve"> </w:t>
+      </w:r>
+      <w:r>
+        <w:t xml:space="preserve">3.0 Competencies to a Regional Context.”</w:t>
+      </w:r>
+      <w:r>
+        <w:t xml:space="preserve"> </w:t>
+      </w:r>
+      <w:r>
+        <w:rPr>
+          <w:i/>
+          <w:iCs/>
+        </w:rPr>
+        <w:t xml:space="preserve">Bioinformatics Advances</w:t>
+      </w:r>
+      <w:r>
+        <w:t xml:space="preserve"> </w:t>
+      </w:r>
+      <w:r>
+        <w:t xml:space="preserve">5 (1): vbaf311.</w:t>
+      </w:r>
+      <w:r>
+        <w:t xml:space="preserve"> </w:t>
+      </w:r>
+      <w:hyperlink r:id="rId107">
+        <w:r>
+          <w:rPr>
+            <w:rStyle w:val="Hyperlink"/>
+          </w:rPr>
+          <w:t xml:space="preserve">https://doi.org/10.1093/bioadv/vbaf311</w:t>
+        </w:r>
+      </w:hyperlink>
+      <w:r>
+        <w:t xml:space="preserve">.</w:t>
+      </w:r>
+    </w:p>
+    <w:bookmarkEnd w:id="108"/>
+    <w:bookmarkStart w:id="110" w:name="ref-via_ten_2011"/>
+    <w:p>
+      <w:pPr>
+        <w:pStyle w:val="Bibliography"/>
+      </w:pPr>
+      <w:r>
         <w:t xml:space="preserve">Via, Allegra, Javier De Las Rivas, Teresa K. Attwood, et al. 2011.</w:t>
       </w:r>
       <w:r>
@@ -3247,7 +4586,7 @@
       <w:r>
         <w:t xml:space="preserve"> </w:t>
       </w:r>
-      <w:hyperlink r:id="rId85">
+      <w:hyperlink r:id="rId109">
         <w:r>
           <w:rPr>
             <w:rStyle w:val="Hyperlink"/>
@@ -3259,13 +4598,68 @@
         <w:t xml:space="preserve">.</w:t>
       </w:r>
     </w:p>
-    <w:bookmarkEnd w:id="86"/>
-    <w:bookmarkStart w:id="88" w:name="ref-wen_bin_goh_rethinking_2026"/>
+    <w:bookmarkEnd w:id="110"/>
+    <w:bookmarkStart w:id="112" w:name="ref-wang_reimagining_2026"/>
     <w:p>
       <w:pPr>
         <w:pStyle w:val="Bibliography"/>
       </w:pPr>
       <w:r>
+        <w:t xml:space="preserve">Wang, Zongran, Liu Mingzhuo, and A. Y. M. Atiquil Islam. 2026.</w:t>
+      </w:r>
+      <w:r>
+        <w:t xml:space="preserve"> </w:t>
+      </w:r>
+      <w:r>
+        <w:t xml:space="preserve">“Reimagining Teacher-</w:t>
+      </w:r>
+      <w:r>
+        <w:t xml:space="preserve">AI</w:t>
+      </w:r>
+      <w:r>
+        <w:t xml:space="preserve"> </w:t>
+      </w:r>
+      <w:r>
+        <w:t xml:space="preserve">Co-Design in Learning Task Design: Trends and Perspectives.”</w:t>
+      </w:r>
+      <w:r>
+        <w:t xml:space="preserve"> </w:t>
+      </w:r>
+      <w:r>
+        <w:rPr>
+          <w:i/>
+          <w:iCs/>
+        </w:rPr>
+        <w:t xml:space="preserve">Humanities and Social Sciences Communications</w:t>
+      </w:r>
+      <w:r>
+        <w:t xml:space="preserve"> </w:t>
+      </w:r>
+      <w:r>
+        <w:t xml:space="preserve">13 (1): 757.</w:t>
+      </w:r>
+      <w:r>
+        <w:t xml:space="preserve"> </w:t>
+      </w:r>
+      <w:hyperlink r:id="rId111">
+        <w:r>
+          <w:rPr>
+            <w:rStyle w:val="Hyperlink"/>
+          </w:rPr>
+          <w:t xml:space="preserve">https://doi.org/10.1057/s41599-026-06981-y</w:t>
+        </w:r>
+      </w:hyperlink>
+      <w:r>
+        <w:t xml:space="preserve">.</w:t>
+      </w:r>
+    </w:p>
+    <w:bookmarkEnd w:id="112"/>
+    <w:bookmarkStart w:id="114" w:name="ref-wen_bin_goh_rethinking_2026"/>
+    <w:p>
+      <w:pPr>
+        <w:pStyle w:val="Bibliography"/>
+      </w:pPr>
+      <w:r>
         <w:t xml:space="preserve">Wen Bin Goh, Wilson, Annikka Polster, Limsoon Wong, and Marija Cvijovic. 2026.</w:t>
       </w:r>
       <w:r>
@@ -3293,7 +4687,7 @@
       <w:r>
         <w:t xml:space="preserve"> </w:t>
       </w:r>
-      <w:hyperlink r:id="rId87">
+      <w:hyperlink r:id="rId113">
         <w:r>
           <w:rPr>
             <w:rStyle w:val="Hyperlink"/>
@@ -3305,8 +4699,8 @@
         <w:t xml:space="preserve">.</w:t>
       </w:r>
     </w:p>
-    <w:bookmarkEnd w:id="88"/>
-    <w:bookmarkStart w:id="90" w:name="ref-wenger_analysing_2024"/>
+    <w:bookmarkEnd w:id="114"/>
+    <w:bookmarkStart w:id="116" w:name="ref-wenger_analysing_2024"/>
     <w:p>
       <w:pPr>
         <w:pStyle w:val="Bibliography"/>
@@ -3363,7 +4757,7 @@
       <w:r>
         <w:t xml:space="preserve"> </w:t>
       </w:r>
-      <w:hyperlink r:id="rId89">
+      <w:hyperlink r:id="rId115">
         <w:r>
           <w:rPr>
             <w:rStyle w:val="Hyperlink"/>
@@ -3375,8 +4769,8 @@
         <w:t xml:space="preserve">.</w:t>
       </w:r>
     </w:p>
-    <w:bookmarkEnd w:id="90"/>
-    <w:bookmarkStart w:id="92" w:name="ref-wickham_ggplot2_2016"/>
+    <w:bookmarkEnd w:id="116"/>
+    <w:bookmarkStart w:id="118" w:name="ref-wickham_ggplot2_2016"/>
     <w:p>
       <w:pPr>
         <w:pStyle w:val="Bibliography"/>
@@ -3400,7 +4794,7 @@
       <w:r>
         <w:t xml:space="preserve"> </w:t>
       </w:r>
-      <w:hyperlink r:id="rId91">
+      <w:hyperlink r:id="rId117">
         <w:r>
           <w:rPr>
             <w:rStyle w:val="Hyperlink"/>
@@ -3412,8 +4806,8 @@
         <w:t xml:space="preserve">.</w:t>
       </w:r>
     </w:p>
-    <w:bookmarkEnd w:id="92"/>
-    <w:bookmarkStart w:id="94" w:name="ref-wickham_dplyr_2026"/>
+    <w:bookmarkEnd w:id="118"/>
+    <w:bookmarkStart w:id="120" w:name="ref-wickham_dplyr_2026"/>
     <w:p>
       <w:pPr>
         <w:pStyle w:val="Bibliography"/>
@@ -3437,7 +4831,7 @@
       <w:r>
         <w:t xml:space="preserve"> </w:t>
       </w:r>
-      <w:hyperlink r:id="rId93">
+      <w:hyperlink r:id="rId119">
         <w:r>
           <w:rPr>
             <w:rStyle w:val="Hyperlink"/>
@@ -3449,9 +4843,139 @@
         <w:t xml:space="preserve">.</w:t>
       </w:r>
     </w:p>
-    <w:bookmarkEnd w:id="94"/>
-    <w:bookmarkEnd w:id="95"/>
-    <w:bookmarkEnd w:id="96"/>
+    <w:bookmarkEnd w:id="120"/>
+    <w:bookmarkStart w:id="122" w:name="ref-wu_unlocking_2024"/>
+    <w:p>
+      <w:pPr>
+        <w:pStyle w:val="Bibliography"/>
+      </w:pPr>
+      <w:r>
+        <w:t xml:space="preserve">Wu, Di, Shuling Zhang, Zhiyuan Ma, Xiao-Guang Yue, and Rebecca Kechen Dong. 2024.</w:t>
+      </w:r>
+      <w:r>
+        <w:t xml:space="preserve"> </w:t>
+      </w:r>
+      <w:r>
+        <w:t xml:space="preserve">“Unlocking</w:t>
+      </w:r>
+      <w:r>
+        <w:t xml:space="preserve"> </w:t>
+      </w:r>
+      <w:r>
+        <w:t xml:space="preserve">Potential</w:t>
+      </w:r>
+      <w:r>
+        <w:t xml:space="preserve">:</w:t>
+      </w:r>
+      <w:r>
+        <w:t xml:space="preserve"> </w:t>
+      </w:r>
+      <w:r>
+        <w:t xml:space="preserve">Key</w:t>
+      </w:r>
+      <w:r>
+        <w:t xml:space="preserve"> </w:t>
+      </w:r>
+      <w:r>
+        <w:t xml:space="preserve">Factors</w:t>
+      </w:r>
+      <w:r>
+        <w:t xml:space="preserve"> </w:t>
+      </w:r>
+      <w:r>
+        <w:t xml:space="preserve">Shaping</w:t>
+      </w:r>
+      <w:r>
+        <w:t xml:space="preserve"> </w:t>
+      </w:r>
+      <w:r>
+        <w:t xml:space="preserve">Undergraduate</w:t>
+      </w:r>
+      <w:r>
+        <w:t xml:space="preserve"> </w:t>
+      </w:r>
+      <w:r>
+        <w:t xml:space="preserve">Self</w:t>
+      </w:r>
+      <w:r>
+        <w:t xml:space="preserve">-</w:t>
+      </w:r>
+      <w:r>
+        <w:t xml:space="preserve">Directed</w:t>
+      </w:r>
+      <w:r>
+        <w:t xml:space="preserve"> </w:t>
+      </w:r>
+      <w:r>
+        <w:t xml:space="preserve">Learning</w:t>
+      </w:r>
+      <w:r>
+        <w:t xml:space="preserve"> </w:t>
+      </w:r>
+      <w:r>
+        <w:t xml:space="preserve">in</w:t>
+      </w:r>
+      <w:r>
+        <w:t xml:space="preserve"> </w:t>
+      </w:r>
+      <w:r>
+        <w:t xml:space="preserve">AI</w:t>
+      </w:r>
+      <w:r>
+        <w:t xml:space="preserve">-</w:t>
+      </w:r>
+      <w:r>
+        <w:t xml:space="preserve">Enhanced</w:t>
+      </w:r>
+      <w:r>
+        <w:t xml:space="preserve"> </w:t>
+      </w:r>
+      <w:r>
+        <w:t xml:space="preserve">Educational</w:t>
+      </w:r>
+      <w:r>
+        <w:t xml:space="preserve"> </w:t>
+      </w:r>
+      <w:r>
+        <w:t xml:space="preserve">Environments</w:t>
+      </w:r>
+      <w:r>
+        <w:t xml:space="preserve">.”</w:t>
+      </w:r>
+      <w:r>
+        <w:t xml:space="preserve"> </w:t>
+      </w:r>
+      <w:r>
+        <w:rPr>
+          <w:i/>
+          <w:iCs/>
+        </w:rPr>
+        <w:t xml:space="preserve">Systems</w:t>
+      </w:r>
+      <w:r>
+        <w:t xml:space="preserve"> </w:t>
+      </w:r>
+      <w:r>
+        <w:t xml:space="preserve">12 (9): 332.</w:t>
+      </w:r>
+      <w:r>
+        <w:t xml:space="preserve"> </w:t>
+      </w:r>
+      <w:hyperlink r:id="rId121">
+        <w:r>
+          <w:rPr>
+            <w:rStyle w:val="Hyperlink"/>
+          </w:rPr>
+          <w:t xml:space="preserve">https://doi.org/10.3390/systems12090332</w:t>
+        </w:r>
+      </w:hyperlink>
+      <w:r>
+        <w:t xml:space="preserve">.</w:t>
+      </w:r>
+    </w:p>
+    <w:bookmarkEnd w:id="122"/>
+    <w:bookmarkEnd w:id="123"/>
+    <w:bookmarkEnd w:id="124"/>
     <w:sectPr>
       <w:footnotePr>
         <w:numRestart w:val="eachSect"/>

</xml_diff>

<commit_message>
adds profile to table and updates word file
</commit_message>
<xml_diff>
--- a/manuscript.docx
+++ b/manuscript.docx
@@ -35,13 +35,10 @@
           <w:b/>
           <w:bCs/>
         </w:rPr>
-        <w:t xml:space="preserve">Background:</w:t>
-      </w:r>
-      <w:r>
-        <w:t xml:space="preserve"> </w:t>
-      </w:r>
-      <w:r>
-        <w:t xml:space="preserve">Bioinformatics training demands are heterogeneous, and it can be challenging to design training programs that meet diverse needs, especially in the context of emerging technologies, like generative AI. To address this, we analyzed the 2026 SIB Swiss Institute of Bioinformatics (SIB) training needs survey using a network-based strategy that identifies respondent subgroups from shared topic preferences.</w:t>
+        <w:t xml:space="preserve">Background</w:t>
+      </w:r>
+      <w:r>
+        <w:t xml:space="preserve">: Bioinformatics training demands are heterogeneous, and it can be challenging to design training programs that meet diverse needs, especially in the context of emerging technologies, like generative AI. To address this, we analyzed the 2026 SIB Swiss Institute of Bioinformatics (SIB) training needs survey using a network-based strategy that identifies respondent subgroups from shared topic preferences.</w:t>
       </w:r>
     </w:p>
     <w:p>
@@ -53,13 +50,10 @@
           <w:b/>
           <w:bCs/>
         </w:rPr>
-        <w:t xml:space="preserve">Methods:</w:t>
-      </w:r>
-      <w:r>
-        <w:t xml:space="preserve"> </w:t>
-      </w:r>
-      <w:r>
-        <w:t xml:space="preserve">We analyzed 260 responses collected over 6 weeks (March-April 2026), including Likert-type ratings for training topics, participation barriers, and preferred course formats, plus demographic variables. Responses were analyzed as a single group and as clusters. For cluster analysis, respondents were represented as nodes in a correlation network built from course-topic ratings and Louvain community detection was applied to identify clusters. Cluster profiles were then characterized using topic priorities, barriers, format preferences, and demographics.</w:t>
+        <w:t xml:space="preserve">Methods</w:t>
+      </w:r>
+      <w:r>
+        <w:t xml:space="preserve">: We analyzed 260 responses collected over 6 weeks (March-April 2026), including Likert-type ratings for training topics, participation barriers, and preferred course formats, as well as demographic variables. Responses were analyzed as a single group and as clusters. For cluster analysis, respondents were represented as nodes in a correlation network built from course-topic ratings and Louvain community detection was applied to identify clusters. Each cluster was then characterized as a learner profile using topic priorities, barriers, format preferences, and demographics.</w:t>
       </w:r>
     </w:p>
     <w:p>
@@ -71,13 +65,10 @@
           <w:b/>
           <w:bCs/>
         </w:rPr>
-        <w:t xml:space="preserve">Results:</w:t>
-      </w:r>
-      <w:r>
-        <w:t xml:space="preserve"> </w:t>
-      </w:r>
-      <w:r>
-        <w:t xml:space="preserve">Respondents indicated their need for training across a total of 33 possible course topics. Four of the possible topics related to AI/LLM skills and all of them were in the top six of most needed topics. Other than AI, there were high demands on reproducible data practices and computational methods. As course format, interactive and multi-day courses were generally preferred. Remarkably, AI-assisted learning formats were the least favored. Network analysis identified four interpretable learner profiles: AI and data, infectious disease genomics, functional genomics, and biochemistry, imaging &amp; AI, with each profile exhibiting distinct training needs and preferences.</w:t>
+        <w:t xml:space="preserve">Results</w:t>
+      </w:r>
+      <w:r>
+        <w:t xml:space="preserve">: Respondents indicated their need for training across a total of 33 possible course topics. Four of the possible topics related to AI/LLM skills and all of them were in the top six of most needed topics. Other than AI, reproducible data practices and computational methods were in high demand. Concerning course formats, interactive and multi-day courses were generally preferred. Remarkably, AI-assisted learning formats were the least favored. Network analysis identified four interpretable learner profiles: AI and data, infectious disease genomics, functional genomics, and biochemistry, imaging &amp; AI, with each profile exhibiting distinct training needs and preferences.</w:t>
       </w:r>
     </w:p>
     <w:p>
@@ -89,13 +80,10 @@
           <w:b/>
           <w:bCs/>
         </w:rPr>
-        <w:t xml:space="preserve">Conclusions:</w:t>
-      </w:r>
-      <w:r>
-        <w:t xml:space="preserve"> </w:t>
-      </w:r>
-      <w:r>
-        <w:t xml:space="preserve">There is a clear need for skills in AI and reproducible research, and respondents favored human interaction in learning formats. Network-based clustering revealed actionable training-need heterogeneity that is not captured by demographic stratification alone. Integrating these learner profiles into curriculum design can improve identification of course topics, format selection, and barrier mitigation, supporting more effective and responsive bioinformatics training programs, particularly in the context of AI and emerging technologies.</w:t>
+        <w:t xml:space="preserve">Conclusions</w:t>
+      </w:r>
+      <w:r>
+        <w:t xml:space="preserve">: There is a clear need for skills in AI and reproducible research, and respondents favored formats involving human interaction. Network-based clustering revealed actionable training-need heterogeneity that is not captured by demographic stratification alone. Integrating these learner profiles into curriculum design can improve identification of course topics, format selection, and barrier mitigation, supporting more effective and responsive bioinformatics training programs, particularly in the context of AI and emerging technologies.</w:t>
       </w:r>
     </w:p>
     <w:bookmarkStart w:id="9" w:name="introduction"/>
@@ -141,7 +129,7 @@
         <w:pStyle w:val="BodyText"/>
       </w:pPr>
       <w:r>
-        <w:t xml:space="preserve">It is an continuous challenge to match the training needs of such a diverse audience. A frequently used tool to understand such needs are training needs surveys</w:t>
+        <w:t xml:space="preserve">It is a continuous challenge to match the training needs of such a diverse audience. A frequently used method to understand such needs are training needs surveys</w:t>
       </w:r>
       <w:r>
         <w:t xml:space="preserve"> </w:t>
@@ -238,7 +226,7 @@
         <w:t xml:space="preserve">(Esiyok et al. 2025; Wu et al. 2024)</w:t>
       </w:r>
       <w:r>
-        <w:t xml:space="preserve">. To understand the impact of AI on training needs, it is therefore important to identify what kind of AI-related topics are required by scientists. This can help training providers to design courses that address the specific needs, and to ensure that AI-related topics are integrated into the curriculum in a way that is relevant and useful for all learners.</w:t>
+        <w:t xml:space="preserve">. To understand the impact of AI on training needs, it is therefore important to identify what kind of AI-related topics are required by scientists. This can help training providers design courses that address the specific needs, and to ensure that AI-related topics are integrated into the curriculum in a way that is relevant and useful for all learners.</w:t>
       </w:r>
     </w:p>
     <w:p>
@@ -246,7 +234,7 @@
         <w:pStyle w:val="BodyText"/>
       </w:pPr>
       <w:r>
-        <w:t xml:space="preserve">This paper describes a data-driven framework for understanding training needs based on the SIB training needs survey in terms of course topics, format, and barriers. By converting individual responses into a correlation graph, we define profiles of learners who share common training needs, regardless of their institutional or regional backgrounds. We detail the underlying data preprocessing pipeline, a conceptual overview of graph construction, and subsequent characterization of the learner profiles with an emphasis on how AI can be incorporated in training programs.</w:t>
+        <w:t xml:space="preserve">This paper describes a data-driven framework for understanding training needs based on the SIB training needs survey in terms of course topics, formats, and barriers. By converting individual responses into a correlation graph, we identify clusters of respondents who share common training needs, regardless of their institutional or regional backgrounds, and characterize each cluster as a learner profile. We detail the underlying data preprocessing pipeline, a conceptual overview of graph construction, and the subsequent characterization of these learner profiles, with an emphasis on how AI can be incorporated in training programs.</w:t>
       </w:r>
     </w:p>
     <w:bookmarkEnd w:id="9"/>
@@ -383,7 +371,7 @@
         </w:numPr>
       </w:pPr>
       <w:r>
-        <w:t xml:space="preserve">Perceived participation barriers: Structural and logistical impediments were quantified using an ordinal scale ranging from</w:t>
+        <w:t xml:space="preserve">Perceived participation barriers: Participation barriers like course fees, travel distance, timing constraints, and prerequisite alignment were quantified using an ordinal scale ranging from</w:t>
       </w:r>
       <w:r>
         <w:t xml:space="preserve"> </w:t>
@@ -404,7 +392,7 @@
         <w:t xml:space="preserve">‘Critical barrier’</w:t>
       </w:r>
       <w:r>
-        <w:t xml:space="preserve">. Evaluated barriers included course fees, travel distance, timing constraints, and prerequisite alignment.</w:t>
+        <w:t xml:space="preserve">.</w:t>
       </w:r>
     </w:p>
     <w:p>
@@ -416,7 +404,7 @@
         </w:numPr>
       </w:pPr>
       <w:r>
-        <w:t xml:space="preserve">Preferred learning formats: Pedagogical delivery formats (e.g., webinars, bring your own data, problem-based learning, multi-day intensive courses, self-paced e-learning, and AI-assisted learning) were quantified using an ordinal scale ranging from</w:t>
+        <w:t xml:space="preserve">Preferred learning formats: Delivery formats like webinars, bring your own data, problem-based learning, multi-day intensive courses, self-paced e-learning, and AI-assisted learning were quantified using an ordinal scale ranging from</w:t>
       </w:r>
       <w:r>
         <w:t xml:space="preserve"> </w:t>
@@ -445,7 +433,7 @@
         <w:pStyle w:val="FirstParagraph"/>
       </w:pPr>
       <w:r>
-        <w:t xml:space="preserve">Demographic covariates were also collected to characterize the respondent pool: career stage, geographic demographics (working country and Swiss canton), organization type (Academia, Healthcare, Industry, Non-profit), and historical interaction (time elapsed since attending their last SIB training course).</w:t>
+        <w:t xml:space="preserve">Demographic data were also collected to characterize the respondent pool: career stage, geographic demographics (working country and Swiss canton), organization type (Academia, Healthcare, Industry, Non-profit), and historical interaction (time elapsed since attending their last SIB training course).</w:t>
       </w:r>
     </w:p>
     <w:p>
@@ -471,7 +459,7 @@
         <w:pStyle w:val="FirstParagraph"/>
       </w:pPr>
       <w:r>
-        <w:t xml:space="preserve">For the questions on training needs, respondents were explicitly permitted to skip technical topics that were not relevant to their work. Consequently, non-responses within the training needs questions were treated as meaningful omissions, i.e. </w:t>
+        <w:t xml:space="preserve">For the questions on training needs, respondents were explicitly permitted to skip topics that were not relevant to their work. Consequently, non-responses within the training needs questions were treated as meaningful omissions, i.e. </w:t>
       </w:r>
       <w:r>
         <w:t xml:space="preserve">‘not relevant’</w:t>
@@ -552,7 +540,7 @@
         </w:r>
       </w:hyperlink>
       <w:r>
-        <w:t xml:space="preserve">). In this network, each individual respondent is represented as a single node. For every possible pair of respondents, we calculated the Pearson correlation coefficient based on their responses across all technical training sub-topics. This score reflects the similarity in their training needs. These similarity scores form the connections (edges) between nodes, where the weight of the connection represents the strength of the positive correlation between those two responses. To eliminate weak background noise and prevent the network from becoming too dense, we filtered based on a threshold of the Pearson correlation coefficient. We calculated the 80th percentile of all positive correlations (corresponding to a correlation coefficient of 0.32) across the dataset and pruned any connection falling below this threshold. Unsupervised clustering of the filtered respondent network was performed using the Louvain community detection algorithm</w:t>
+        <w:t xml:space="preserve">). In this network, each individual respondent is represented as a single node. For every possible pair of respondents, we calculated the Pearson correlation coefficient based on their responses across all training sub-topics. This score reflects the similarity in their training needs. These similarity scores form the connections (edges) between nodes, where the weight of the connection represents the strength of the positive correlation between those two responses. To eliminate weak background noise and prevent the network from becoming too dense, we filtered based on a threshold of the Pearson correlation coefficient. We calculated the 80th percentile of all positive correlations (corresponding to a correlation coefficient of 0.32) across the dataset and pruned any connection falling below this threshold. Unsupervised clustering of the filtered respondent network was performed using the Louvain community detection algorithm</w:t>
       </w:r>
       <w:r>
         <w:t xml:space="preserve"> </w:t>
@@ -564,22 +552,7 @@
         <w:t xml:space="preserve"> </w:t>
       </w:r>
       <w:r>
-        <w:t xml:space="preserve">using a resolution of 1. The network analysis and community detection was conducted using the</w:t>
-      </w:r>
-      <w:r>
-        <w:t xml:space="preserve"> </w:t>
-      </w:r>
-      <w:r>
-        <w:rPr>
-          <w:rStyle w:val="VerbatimChar"/>
-        </w:rPr>
-        <w:t xml:space="preserve">igraph</w:t>
-      </w:r>
-      <w:r>
-        <w:t xml:space="preserve"> </w:t>
-      </w:r>
-      <w:r>
-        <w:t xml:space="preserve">package in R</w:t>
+        <w:t xml:space="preserve">using a resolution of 1. The network analysis and community detection was conducted using the igraph package in R</w:t>
       </w:r>
       <w:r>
         <w:t xml:space="preserve"> </w:t>
@@ -662,7 +635,7 @@
               <w:pStyle w:val="ImageCaption"/>
             </w:pPr>
             <w:r>
-              <w:t xml:space="preserve">Figure 1: Graph-based clustering workflow for identifying learner archetypes. Respondents are modeled as nodes in a network, with edges representing pairwise correlation of training needs. Louvain community detection is applied to identify clusters of respondents with similar training needs.</w:t>
+              <w:t xml:space="preserve">Figure 1: Graph-based clustering workflow for identifying learner profiles. Respondents are modeled as nodes in a network, with edges representing pairwise correlation of training needs. Louvain community detection is applied to identify clusters of respondents with similar training needs, which are subsequently characterized as distinct learner profiles.</w:t>
             </w:r>
           </w:p>
           <w:bookmarkEnd w:id="15"/>
@@ -694,7 +667,7 @@
         <w:pStyle w:val="FirstParagraph"/>
       </w:pPr>
       <w:r>
-        <w:t xml:space="preserve">In total 260 responses were gathered, of which 175 (67.3%) were from Switzerland (</w:t>
+        <w:t xml:space="preserve">A total of 260 responses were gathered, of which 175 (67.3%) were from Switzerland (</w:t>
       </w:r>
       <w:hyperlink w:anchor="fig-demographics">
         <w:r>
@@ -1346,15 +1319,17 @@
           <w:tbl>
             <w:tblPr>
               <w:tblStyle w:val="Table"/>
-              <w:tblW w:type="auto" w:w="0"/>
+              <w:tblW w:type="pct" w:w="5000"/>
+              <w:tblLayout w:type="fixed"/>
               <w:tblLook w:firstRow="1" w:lastRow="0" w:firstColumn="0" w:lastColumn="0" w:noHBand="0" w:noVBand="0" w:val="0020"/>
             </w:tblPr>
             <w:tblGrid>
-              <w:gridCol w:w="1584"/>
-              <w:gridCol w:w="1584"/>
-              <w:gridCol w:w="1584"/>
-              <w:gridCol w:w="1584"/>
-              <w:gridCol w:w="1584"/>
+              <w:gridCol w:w="851"/>
+              <w:gridCol w:w="2384"/>
+              <w:gridCol w:w="1021"/>
+              <w:gridCol w:w="1277"/>
+              <w:gridCol w:w="1277"/>
+              <w:gridCol w:w="1107"/>
             </w:tblGrid>
             <w:tr>
               <w:trPr>
@@ -1378,11 +1353,24 @@
                 <w:p>
                   <w:pPr>
                     <w:pStyle w:val="Compact"/>
+                    <w:jc w:val="left"/>
+                    <w:jc w:val="center"/>
+                  </w:pPr>
+                  <w:r>
+                    <w:t xml:space="preserve">profile</w:t>
+                  </w:r>
+                </w:p>
+              </w:tc>
+              <w:tc>
+                <w:tcPr/>
+                <w:p>
+                  <w:pPr>
+                    <w:pStyle w:val="Compact"/>
                     <w:jc w:val="right"/>
                     <w:jc w:val="center"/>
                   </w:pPr>
                   <w:r>
-                    <w:t xml:space="preserve">nodes</w:t>
+                    <w:t xml:space="preserve">respondents</w:t>
                   </w:r>
                 </w:p>
               </w:tc>
@@ -1437,6 +1425,19 @@
                   </w:pPr>
                   <w:r>
                     <w:t xml:space="preserve">Cluster 1</w:t>
+                  </w:r>
+                </w:p>
+              </w:tc>
+              <w:tc>
+                <w:tcPr/>
+                <w:p>
+                  <w:pPr>
+                    <w:pStyle w:val="Compact"/>
+                    <w:jc w:val="left"/>
+                    <w:jc w:val="center"/>
+                  </w:pPr>
+                  <w:r>
+                    <w:t xml:space="preserve">AI and Data</w:t>
                   </w:r>
                 </w:p>
               </w:tc>
@@ -1512,6 +1513,19 @@
                 <w:p>
                   <w:pPr>
                     <w:pStyle w:val="Compact"/>
+                    <w:jc w:val="left"/>
+                    <w:jc w:val="center"/>
+                  </w:pPr>
+                  <w:r>
+                    <w:t xml:space="preserve">Infectious Disease Genomics</w:t>
+                  </w:r>
+                </w:p>
+              </w:tc>
+              <w:tc>
+                <w:tcPr/>
+                <w:p>
+                  <w:pPr>
+                    <w:pStyle w:val="Compact"/>
                     <w:jc w:val="right"/>
                     <w:jc w:val="center"/>
                   </w:pPr>
@@ -1571,6 +1585,19 @@
                   </w:pPr>
                   <w:r>
                     <w:t xml:space="preserve">Cluster 3</w:t>
+                  </w:r>
+                </w:p>
+              </w:tc>
+              <w:tc>
+                <w:tcPr/>
+                <w:p>
+                  <w:pPr>
+                    <w:pStyle w:val="Compact"/>
+                    <w:jc w:val="left"/>
+                    <w:jc w:val="center"/>
+                  </w:pPr>
+                  <w:r>
+                    <w:t xml:space="preserve">Functional Genomics</w:t>
                   </w:r>
                 </w:p>
               </w:tc>
@@ -1646,6 +1673,19 @@
                 <w:p>
                   <w:pPr>
                     <w:pStyle w:val="Compact"/>
+                    <w:jc w:val="left"/>
+                    <w:jc w:val="center"/>
+                  </w:pPr>
+                  <w:r>
+                    <w:t xml:space="preserve">Biochemistry, Imaging &amp; AI</w:t>
+                  </w:r>
+                </w:p>
+              </w:tc>
+              <w:tc>
+                <w:tcPr/>
+                <w:p>
+                  <w:pPr>
+                    <w:pStyle w:val="Compact"/>
                     <w:jc w:val="right"/>
                     <w:jc w:val="center"/>
                   </w:pPr>
@@ -1715,7 +1755,39 @@
         <w:pStyle w:val="FirstParagraph"/>
       </w:pPr>
       <w:r>
-        <w:t xml:space="preserve">The four resulting clusters were characterized by distinct training needs, shown by their top 10 of most liked topics (</w:t>
+        <w:t xml:space="preserve">Throughout this section, we refer to a</w:t>
+      </w:r>
+      <w:r>
+        <w:t xml:space="preserve"> </w:t>
+      </w:r>
+      <w:r>
+        <w:rPr>
+          <w:i/>
+          <w:iCs/>
+        </w:rPr>
+        <w:t xml:space="preserve">cluster</w:t>
+      </w:r>
+      <w:r>
+        <w:t xml:space="preserve"> </w:t>
+      </w:r>
+      <w:r>
+        <w:t xml:space="preserve">as the group of respondents identified via community detection, and to a</w:t>
+      </w:r>
+      <w:r>
+        <w:t xml:space="preserve"> </w:t>
+      </w:r>
+      <w:r>
+        <w:rPr>
+          <w:i/>
+          <w:iCs/>
+        </w:rPr>
+        <w:t xml:space="preserve">learner profile</w:t>
+      </w:r>
+      <w:r>
+        <w:t xml:space="preserve"> </w:t>
+      </w:r>
+      <w:r>
+        <w:t xml:space="preserve">as the qualitative characterization of a cluster’s shared training needs, barriers, format preferences and demographics. The four resulting clusters were characterized by distinct training needs, shown by their top 10 of most liked topics (</w:t>
       </w:r>
       <w:hyperlink w:anchor="fig-topics-by-cluster">
         <w:r>
@@ -1737,7 +1809,7 @@
         </w:r>
       </w:hyperlink>
       <w:r>
-        <w:t xml:space="preserve">). Cluster 1 (</w:t>
+        <w:t xml:space="preserve">). Based on these distinct needs, we defined four learner profiles: Cluster 1 (</w:t>
       </w:r>
       <w:hyperlink w:anchor="fig-topics-by-cluster">
         <w:r>
@@ -1751,7 +1823,7 @@
         <w:t xml:space="preserve"> </w:t>
       </w:r>
       <w:r>
-        <w:t xml:space="preserve">A; referred to as</w:t>
+        <w:t xml:space="preserve">A) is characterized by an interest in best practices in AI and data, including application of LLMs and reproducible and FAIR data, and is hereafter referred to as the</w:t>
       </w:r>
       <w:r>
         <w:t xml:space="preserve"> </w:t>
@@ -1760,7 +1832,10 @@
         <w:t xml:space="preserve">‘AI and data’</w:t>
       </w:r>
       <w:r>
-        <w:t xml:space="preserve">) is characterized by an interest in best practices in AI and data, including application LLMs and reproducible and FAIR Data. Cluster 2 (</w:t>
+        <w:t xml:space="preserve"> </w:t>
+      </w:r>
+      <w:r>
+        <w:t xml:space="preserve">profile. Cluster 2 (</w:t>
       </w:r>
       <w:hyperlink w:anchor="fig-topics-by-cluster">
         <w:r>
@@ -1774,7 +1849,7 @@
         <w:t xml:space="preserve"> </w:t>
       </w:r>
       <w:r>
-        <w:t xml:space="preserve">B; referred to as</w:t>
+        <w:t xml:space="preserve">B) is characterized by infectious disease topics and possibly ecology, with an interest in phylogenetics, pathogen genomics and epidemiology, and is referred to as the</w:t>
       </w:r>
       <w:r>
         <w:t xml:space="preserve"> </w:t>
@@ -1783,7 +1858,10 @@
         <w:t xml:space="preserve">‘Infectious disease genomics’</w:t>
       </w:r>
       <w:r>
-        <w:t xml:space="preserve">) is characterized by infectious disease topics and possibly ecology, with an interest in phylogenetics, pathogen genomics and epidemiology. Cluster 3 (</w:t>
+        <w:t xml:space="preserve"> </w:t>
+      </w:r>
+      <w:r>
+        <w:t xml:space="preserve">profile. Cluster 3 (</w:t>
       </w:r>
       <w:hyperlink w:anchor="fig-topics-by-cluster">
         <w:r>
@@ -1797,7 +1875,7 @@
         <w:t xml:space="preserve"> </w:t>
       </w:r>
       <w:r>
-        <w:t xml:space="preserve">C; referred to as</w:t>
+        <w:t xml:space="preserve">C) is characterized by an interest in functional genomics topics, with an interest in transcriptomics and epigenetics, and is referred to as the</w:t>
       </w:r>
       <w:r>
         <w:t xml:space="preserve"> </w:t>
@@ -1806,7 +1884,10 @@
         <w:t xml:space="preserve">‘Functional genomics’</w:t>
       </w:r>
       <w:r>
-        <w:t xml:space="preserve">) is characterized by an interest in functional genomics topics, with an interest in transcriptomics and epigenetics. Cluster 4 (</w:t>
+        <w:t xml:space="preserve"> </w:t>
+      </w:r>
+      <w:r>
+        <w:t xml:space="preserve">profile. Cluster 4 (</w:t>
       </w:r>
       <w:hyperlink w:anchor="fig-topics-by-cluster">
         <w:r>
@@ -1820,7 +1901,7 @@
         <w:t xml:space="preserve"> </w:t>
       </w:r>
       <w:r>
-        <w:t xml:space="preserve">D; referred to as</w:t>
+        <w:t xml:space="preserve">D) is characterized by training needs on AI, biochemistry and imaging, with an interest in proteomics, mass spectrometry and imaging and omics data integration, and is referred to as the</w:t>
       </w:r>
       <w:r>
         <w:t xml:space="preserve"> </w:t>
@@ -1829,7 +1910,10 @@
         <w:t xml:space="preserve">‘Biochemistry, imaging &amp; AI’</w:t>
       </w:r>
       <w:r>
-        <w:t xml:space="preserve">) is characterized by training needs on AI, biochemistry and imaging, with an interest in proteomics, mass spectrometry and imaging and omics data integration. All clusters have topics related to AI in their top 10, indicating that AI is a cross-cutting theme across all clusters.</w:t>
+        <w:t xml:space="preserve"> </w:t>
+      </w:r>
+      <w:r>
+        <w:t xml:space="preserve">profile. All clusters have topics related to AI in their top 10, indicating that AI is a cross-cutting theme across all learner profiles.</w:t>
       </w:r>
     </w:p>
     <w:tbl>
@@ -1940,7 +2024,7 @@
         <w:pStyle w:val="BodyText"/>
       </w:pPr>
       <w:r>
-        <w:t xml:space="preserve">These clusters can be further characerized based on demographic characteristics (</w:t>
+        <w:t xml:space="preserve">These learner profiles can be further characterized based on demographic characteristics (</w:t>
       </w:r>
       <w:hyperlink w:anchor="fig-cluster-pie-career">
         <w:r>
@@ -1951,7 +2035,19 @@
         </w:r>
       </w:hyperlink>
       <w:r>
-        <w:t xml:space="preserve">; Supplementary Figure X), structural barriers to participation (Supplementary Figure X), and preferred learning formats (Supplementary Figure X). Such analyses can help training providers to design targeted curricula that address the specific needs of each cluster. For example, Cluster 1 (AI &amp; data) has a higher proportion of early-career scientists (PhD candidates and postdoctoral researchers;</w:t>
+        <w:t xml:space="preserve">; Supplementary Figure X), structural barriers to participation (Supplementary Figure X), and preferred learning formats (Supplementary Figure X). Such analyses can help training providers design targeted curricula that address the specific needs of each profile. For example, the</w:t>
+      </w:r>
+      <w:r>
+        <w:t xml:space="preserve"> </w:t>
+      </w:r>
+      <w:r>
+        <w:t xml:space="preserve">‘AI and data’</w:t>
+      </w:r>
+      <w:r>
+        <w:t xml:space="preserve"> </w:t>
+      </w:r>
+      <w:r>
+        <w:t xml:space="preserve">profile (Cluster 1) has a higher proportion of early-career scientists (PhD candidates and postdoctoral researchers;</w:t>
       </w:r>
       <w:r>
         <w:t xml:space="preserve"> </w:t>
@@ -1965,7 +2061,19 @@
         </w:r>
       </w:hyperlink>
       <w:r>
-        <w:t xml:space="preserve">) and a higher proportion of respondents from academia (Supplmentary Figure X), while Cluster 4 (Biochemistry, imaging &amp; AI) has a higher proportion of senior scientists and respondents from industry. These differences in demographics can inform the design of training programs that are tailored to the specific needs and preferences of each cluster.</w:t>
+        <w:t xml:space="preserve">) and a higher proportion of respondents from academia (Supplementary Figure X), while the</w:t>
+      </w:r>
+      <w:r>
+        <w:t xml:space="preserve"> </w:t>
+      </w:r>
+      <w:r>
+        <w:t xml:space="preserve">‘Biochemistry, imaging &amp; AI’</w:t>
+      </w:r>
+      <w:r>
+        <w:t xml:space="preserve"> </w:t>
+      </w:r>
+      <w:r>
+        <w:t xml:space="preserve">profile (Cluster 4) has a higher proportion of senior scientists and respondents from industry. These differences in demographics can inform the design of training programs that are tailored to the specific needs and preferences of each learner profile.</w:t>
       </w:r>
     </w:p>
     <w:tbl>
@@ -2063,7 +2171,7 @@
         <w:pStyle w:val="FirstParagraph"/>
       </w:pPr>
       <w:r>
-        <w:t xml:space="preserve">The results of the SIB training survey provide a snapshot on bioinformatics training needs of scientists in spring 2026, a period in which generative AI and large language models (LLMs) have become increasingly relevant. The survey design and analysis framework is unique within the context of bioinformatics education, and provides a comprehensive approach to understanding training needs, participation barriers, and preferred learning formats. Here, we discuss the overall survey outcomes that can be used for curriculum design on the short term, and the advantages of the analysis approach that can serve as a blueprint for future surveys on training needs.</w:t>
+        <w:t xml:space="preserve">The results of the SIB training survey provide a snapshot of the bioinformatics training needs of scientists in spring 2026, a period in which generative AI and large language models (LLMs) became increasingly relevant. The survey design and analysis framework is unique within the context of bioinformatics education, and provides a comprehensive approach to understanding training needs, participation barriers, and preferred learning formats. Here, we discuss the overall survey outcomes that can be used for curriculum design on the short term, and the advantages of the analysis approach that can serve as a blueprint for future surveys on training needs.</w:t>
       </w:r>
     </w:p>
     <w:bookmarkStart w:id="54" w:name="overall-survey-outcomes"/>
@@ -2080,7 +2188,7 @@
         <w:pStyle w:val="FirstParagraph"/>
       </w:pPr>
       <w:r>
-        <w:t xml:space="preserve">The majority of respondents were working in Switzerland as an academic researcher, likely because the survey was primarily advertised through the SIB training mailing list and other academic channels and networks within Switzerland. This was a good outcome for the aims of the survey because, academic researchers working in Switzerland are the main target group of SIB training. Nevertheless, we think that the survey results can be used for similar training curricula in other countries. Here, we discuss the overall survey outcomes along the three dimensions of training needs, participation barriers and learning formats.</w:t>
+        <w:t xml:space="preserve">The majority of respondents were working in Switzerland as an academic researcher, likely because the survey was primarily advertised through the SIB training mailing list and other academic channels and networks within Switzerland. This outcome aligns well with the aims of the survey, as SIB training is primarily intended for academic researchers working in Switzerland. Nevertheless, we think that the survey results can be used for similar training curricula in other countries. Here, we discuss the overall survey outcomes along the three dimensions of training needs, participation barriers and learning formats.</w:t>
       </w:r>
     </w:p>
     <w:bookmarkStart w:id="51" w:name="Xbd19bfc40f747e39b38feba064da9cf9f06c1ca"/>
@@ -2097,7 +2205,7 @@
         <w:pStyle w:val="FirstParagraph"/>
       </w:pPr>
       <w:r>
-        <w:t xml:space="preserve">From the complete pool of survey results, it becomes clear that there is a demand for training on using (generative) AI and LLMs. Four of the possible topics related to AI/LLM skills and all of them were in the top six of most needed topics. The two courses that were indicated as most needed were on how to use AI effectively:</w:t>
+        <w:t xml:space="preserve">From the complete pool of survey results, it becomes clear that there is a demand for training on using (generative) AI and LLMs. Four of the possible topics related to AI/LLM skills and all four of them were in the top six of most needed topics. The two courses that were indicated as most needed were on how to use AI effectively:</w:t>
       </w:r>
       <w:r>
         <w:t xml:space="preserve"> </w:t>
@@ -2133,7 +2241,7 @@
         <w:t xml:space="preserve">(Sidhu et al. 2024; Wen Bin Goh et al. 2026)</w:t>
       </w:r>
       <w:r>
-        <w:t xml:space="preserve">, and it is reassuring to see that the respondents are aware of this gap and are interested in learning more about it, particulary in the learner profile</w:t>
+        <w:t xml:space="preserve">, and it is reassuring to see that the respondents are aware of this gap and are interested in learning more about it, particularly in the</w:t>
       </w:r>
       <w:r>
         <w:t xml:space="preserve"> </w:t>
@@ -2145,7 +2253,7 @@
         <w:t xml:space="preserve"> </w:t>
       </w:r>
       <w:r>
-        <w:t xml:space="preserve">(Cluster 1).</w:t>
+        <w:t xml:space="preserve">profile (Cluster 1).</w:t>
       </w:r>
     </w:p>
     <w:p>
@@ -2177,7 +2285,7 @@
         <w:t xml:space="preserve"> </w:t>
       </w:r>
       <w:r>
-        <w:t xml:space="preserve">as 3rd and 4th most needed respectively. This shows awareness of a need for learning about open and reproducible research practices amongst most repsondents, which corresponds with earlier findings regarding perceptions on FAIR data practices</w:t>
+        <w:t xml:space="preserve">as 3rd and 4th most needed respectively. This shows awareness of a need for learning about open and reproducible research practices amongst most respondents, which corresponds with earlier findings regarding perceptions on FAIR data practices</w:t>
       </w:r>
       <w:r>
         <w:t xml:space="preserve"> </w:t>
@@ -2212,7 +2320,7 @@
         <w:t xml:space="preserve">(Sheeran and Webb 2016)</w:t>
       </w:r>
       <w:r>
-        <w:t xml:space="preserve">. Despite the questions on training needs were phrased in a way that the answer should relate to the respondents’ own training needs (</w:t>
+        <w:t xml:space="preserve">. Although the questions on training needs were phrased in a way that the answer should relate to the respondents’ own training needs (</w:t>
       </w:r>
       <w:r>
         <w:t xml:space="preserve">“.. specify your training needs ..”</w:t>
@@ -2257,7 +2365,7 @@
         <w:t xml:space="preserve">(Meng et al. 2024)</w:t>
       </w:r>
       <w:r>
-        <w:t xml:space="preserve">. Regarding fees, SIB charges fall within a similar range compared to other European curricula targeting the same audience (e.g., EMBL-EBI courses, VIB training), though revenues do not cover all costs. Consequently, there is limited flexibility to further reduce this barrier without jeopardizing financial sustainability.</w:t>
+        <w:t xml:space="preserve">. Regarding fees, SIB charges fall within a similar range compared to other European curricula targeting the same audience (e.g., EMBL-EBI courses, VIB training), although course fees do not cover all costs. Consequently, there is limited flexibility to further reduce this barrier without jeopardizing financial sustainability.</w:t>
       </w:r>
     </w:p>
     <w:bookmarkEnd w:id="52"/>
@@ -2371,19 +2479,63 @@
         <w:pStyle w:val="BodyText"/>
       </w:pPr>
       <w:r>
-        <w:t xml:space="preserve">By using graph-based clustering of the answers on training topics, we got a much more granular view, resulting in insights that would remain hidden otherwise. For example, the topic</w:t>
-      </w:r>
-      <w:r>
-        <w:t xml:space="preserve"> </w:t>
-      </w:r>
-      <w:r>
-        <w:t xml:space="preserve">‘AI-assisted coding and analysis’</w:t>
-      </w:r>
-      <w:r>
-        <w:t xml:space="preserve"> </w:t>
-      </w:r>
-      <w:r>
-        <w:t xml:space="preserve">was indicated as most needed by the complete pool of respondents, but when looking at the clusters, it was only in the most needed topic in Cluster 1 (AI &amp; Data; 1st most needed), and not even in the top 10 for cluster 3 (Functional genomics). This shows that organising a course on this topic would serve the primary needs of Cluster 1, but only partly of respondents in the other clusters. This works the other way around as well. For example, the topic</w:t>
+        <w:t xml:space="preserve">By using graph-based clustering of the answers on training topics, we got a much more granular view, revealing insights that would otherwise remain hidden. For example, the topic</w:t>
+      </w:r>
+      <w:r>
+        <w:t xml:space="preserve"> </w:t>
+      </w:r>
+      <w:r>
+        <w:t xml:space="preserve">“AI-assisted coding and analysis”</w:t>
+      </w:r>
+      <w:r>
+        <w:t xml:space="preserve"> </w:t>
+      </w:r>
+      <w:r>
+        <w:t xml:space="preserve">was ranked as most needed by the complete pool of respondents. Within the clusters, though, it was the most needed topic in the</w:t>
+      </w:r>
+      <w:r>
+        <w:t xml:space="preserve"> </w:t>
+      </w:r>
+      <w:r>
+        <w:t xml:space="preserve">‘AI and data’</w:t>
+      </w:r>
+      <w:r>
+        <w:t xml:space="preserve"> </w:t>
+      </w:r>
+      <w:r>
+        <w:t xml:space="preserve">profile (Cluster 1), but not even in the top 10 for the</w:t>
+      </w:r>
+      <w:r>
+        <w:t xml:space="preserve"> </w:t>
+      </w:r>
+      <w:r>
+        <w:t xml:space="preserve">‘Functional genomics’</w:t>
+      </w:r>
+      <w:r>
+        <w:t xml:space="preserve"> </w:t>
+      </w:r>
+      <w:r>
+        <w:t xml:space="preserve">profile (Cluster 3). This shows that organising a course on this topic would serve the primary needs of the</w:t>
+      </w:r>
+      <w:r>
+        <w:t xml:space="preserve"> </w:t>
+      </w:r>
+      <w:r>
+        <w:t xml:space="preserve">‘AI and data’</w:t>
+      </w:r>
+      <w:r>
+        <w:t xml:space="preserve"> </w:t>
+      </w:r>
+      <w:r>
+        <w:t xml:space="preserve">profile, but only partly those of respondents in the other learner profiles.</w:t>
+      </w:r>
+    </w:p>
+    <w:p>
+      <w:pPr>
+        <w:pStyle w:val="BodyText"/>
+      </w:pPr>
+      <w:r>
+        <w:t xml:space="preserve">The reverse also occurs. The topic</w:t>
       </w:r>
       <w:r>
         <w:t xml:space="preserve"> </w:t>
@@ -2395,7 +2547,19 @@
         <w:t xml:space="preserve"> </w:t>
       </w:r>
       <w:r>
-        <w:t xml:space="preserve">was the 15th most needed topic in the complete pool of respondents, indicating a moderately to low priority to organize a course on the topic. However, it was the first most needed topic in Cluster 2 (Infectious disease genomics), showing that organising a course on this topic would serve the primary needs of a substantial group of respondents, and this would not be visible when looking at the complete pool of respondents.</w:t>
+        <w:t xml:space="preserve">ranked 15th among the complete pool of respondents, suggesting a moderate to low priority. Within the</w:t>
+      </w:r>
+      <w:r>
+        <w:t xml:space="preserve"> </w:t>
+      </w:r>
+      <w:r>
+        <w:t xml:space="preserve">‘Infectious disease genomics’</w:t>
+      </w:r>
+      <w:r>
+        <w:t xml:space="preserve"> </w:t>
+      </w:r>
+      <w:r>
+        <w:t xml:space="preserve">profile (Cluster 2), however, it was the single most needed topic. Since respondents were fairly evenly distributed across clusters, each learner profile deserves similar attention when designing a curriculum that matches these heterogeneous training needs. Organising courses around profile-specific topics, rather than relying on the aggregate ranking alone, would therefore better serve substantial groups of respondents.</w:t>
       </w:r>
     </w:p>
     <w:p>
@@ -2403,7 +2567,31 @@
         <w:pStyle w:val="BodyText"/>
       </w:pPr>
       <w:r>
-        <w:t xml:space="preserve">The clusters also enable a more targeted approach to address barriers to participation, learning formats and demographics. For example, Cluster 1 (AI &amp; Data) has a higher proportion of early-career scientists and a higher proportion of respondents from Swiss universities, while Cluster 4 (Biochemistry, imaging &amp; AI) has a higher proportion of senior scientists and respondents from industry. These differences in demographics can inform the design of training programs that are tailored to the specific needs and preferences of each learner profile.</w:t>
+        <w:t xml:space="preserve">The learner profiles also enable a more targeted approach to address barriers to participation, learning formats and demographics. For example, the</w:t>
+      </w:r>
+      <w:r>
+        <w:t xml:space="preserve"> </w:t>
+      </w:r>
+      <w:r>
+        <w:t xml:space="preserve">‘AI and data’</w:t>
+      </w:r>
+      <w:r>
+        <w:t xml:space="preserve"> </w:t>
+      </w:r>
+      <w:r>
+        <w:t xml:space="preserve">profile (Cluster 1) has a higher proportion of early-career scientists and a higher proportion of respondents from Swiss universities, while the</w:t>
+      </w:r>
+      <w:r>
+        <w:t xml:space="preserve"> </w:t>
+      </w:r>
+      <w:r>
+        <w:t xml:space="preserve">‘Biochemistry, imaging &amp; AI’</w:t>
+      </w:r>
+      <w:r>
+        <w:t xml:space="preserve"> </w:t>
+      </w:r>
+      <w:r>
+        <w:t xml:space="preserve">profile (Cluster 4) has a higher proportion of senior scientists and respondents from industry. These differences in demographics can inform the design of training programs that are tailored to the specific needs and preferences of each learner profile.</w:t>
       </w:r>
     </w:p>
     <w:bookmarkEnd w:id="55"/>
@@ -2422,7 +2610,7 @@
         <w:pStyle w:val="FirstParagraph"/>
       </w:pPr>
       <w:r>
-        <w:t xml:space="preserve">This study demonstrates the utility of network analysis and community detection for understanding training needs and tranlsating them into curriculum design. By clustering respondents based on their shared needs rather than demographics, we identified four meaningful learner profiles. Overall and within those profiles, there is a clear need for training AI-related topics. The dislike of AI-assisted learning formats, and preference of synchronous interacitve formats shows a need for human interaction during training, and raises questions on trust and liability issues while using AI in the classroom. Tailoring training curricula to these empirically derived learner profiles enables training providers to effectively address topical needs, participation barriers and teaching formats in order to ensure educational effectiveness in a rapidly evolving scientific landscape.</w:t>
+        <w:t xml:space="preserve">This study demonstrates the utility of network analysis and community detection for understanding training needs and translating them into curriculum design. By clustering respondents based on their shared needs rather than demographics, we identified four meaningful learner profiles. Overall and within those profiles, there is a clear need for training on AI-related topics. The dislike of AI-assisted learning formats, and preference for synchronous interactive formats shows a need for human interaction during training, and raises questions on trust and liability issues while using AI in the classroom. Tailoring training curricula to these empirically derived learner profiles enables training providers to effectively address topical needs, participation barriers and teaching formats in order to ensure educational effectiveness in a rapidly evolving scientific landscape.</w:t>
       </w:r>
     </w:p>
     <w:bookmarkStart w:id="129" w:name="refs"/>

</xml_diff>

<commit_message>
fixes issue with network figure
</commit_message>
<xml_diff>
--- a/manuscript.docx
+++ b/manuscript.docx
@@ -261,7 +261,7 @@
         <w:pStyle w:val="FirstParagraph"/>
       </w:pPr>
       <w:r>
-        <w:t xml:space="preserve">The SIB training needs survey was designed to collect information using mostly multiple-choice and Likert-type questions. All survey questions, and anonymized responses, can be found on Zenodo (https://zenodo.org/records/20446763). At its core, the questionnaire evaluated course topics, barriers and formats using 5-point Likert-type scales:</w:t>
+        <w:t xml:space="preserve">The SIB training needs survey was designed to collect information using mostly multiple-choice and Likert-type questions. All survey questions, and anonymized responses, can be found in Supplementary Data 1. At its core, the questionnaire evaluated course topics, barriers and formats using 5-point Likert-type scales:</w:t>
       </w:r>
     </w:p>
     <w:p>
@@ -923,7 +923,7 @@
               <w:t xml:space="preserve">“Absolutely essential”</w:t>
             </w:r>
             <w:r>
-              <w:t xml:space="preserve">). Some topics have been abbreviated for clarity; the full topic names presented to the respondents can be found in the Supplementary Materials.</w:t>
+              <w:t xml:space="preserve">). Some topics have been abbreviated for clarity; the full topic names presented to the respondents can be found in Supplementary Data 2.</w:t>
             </w:r>
           </w:p>
           <w:bookmarkEnd w:id="25"/>
@@ -1143,7 +1143,7 @@
               <w:t xml:space="preserve">“Specify which learning formats you prefer. Note: these are not mutually exclusive, i.e. some can be used in combination”</w:t>
             </w:r>
             <w:r>
-              <w:t xml:space="preserve">. The formats are ordered by the proportion of respondents who indicated that they liked or strongly liked the format. The original answers included an explanation of the format. For the full answers, please refer to the Supplementary Materials.</w:t>
+              <w:t xml:space="preserve">. The formats are ordered by the proportion of respondents who indicated that they liked or strongly liked the format. The original answers included an explanation of the format. For the full answers, please refer to Supplementary Data 2.</w:t>
             </w:r>
           </w:p>
           <w:bookmarkEnd w:id="33"/>
@@ -2012,7 +2012,7 @@
               <w:t xml:space="preserve"> </w:t>
             </w:r>
             <w:r>
-              <w:t xml:space="preserve">(dark green) are shown. The numbers in the bars represent the count of respondents within the respective cluster selecting the answer. (A) Cluster 1: AI and data. (B) Cluster 2: Infectious disease genomics. (C) Cluster 3: Functional genomics. (D) Cluster 4: Biochemistry, imaging &amp; AI. Some topics have been abbreviated for clarity; the full topic names presented to the respondents can be found in the Supplementary Materials.</w:t>
+              <w:t xml:space="preserve">(dark green) are shown. The numbers in the bars represent the count of respondents within the respective cluster selecting the answer. (A) Cluster 1: AI and data. (B) Cluster 2: Infectious disease genomics. (C) Cluster 3: Functional genomics. (D) Cluster 4: Biochemistry, imaging &amp; AI. Some topics have been abbreviated for clarity; the full topic names presented to the respondents can be found in Supplementary Data 2.</w:t>
             </w:r>
           </w:p>
           <w:bookmarkEnd w:id="44"/>
@@ -2035,7 +2035,7 @@
         </w:r>
       </w:hyperlink>
       <w:r>
-        <w:t xml:space="preserve">; Supplementary Figure X), structural barriers to participation (Supplementary Figure X), and preferred learning formats (Supplementary Figure X). Such analyses can help training providers design targeted curricula that address the specific needs of each profile. For example, the</w:t>
+        <w:t xml:space="preserve">; Supplementary Figure 1-3), structural barriers to participation (Supplementary Figure 4), and preferred learning formats (Supplementary Figure 5). Such analyses can help training providers design targeted curricula that address the specific needs of each profile. For example, the</w:t>
       </w:r>
       <w:r>
         <w:t xml:space="preserve"> </w:t>

</xml_diff>